<commit_message>
Me faltaban los flujos alternativos 4 y 5 por cubrir.
</commit_message>
<xml_diff>
--- a/test/AppForSEII2526.UIT/CU_Oferta/TC_CU_Oferta.docx
+++ b/test/AppForSEII2526.UIT/CU_Oferta/TC_CU_Oferta.docx
@@ -1309,7 +1309,7 @@
       </w:tblPr>
       <w:tblGrid>
         <w:gridCol w:w="1252"/>
-        <w:gridCol w:w="1551"/>
+        <w:gridCol w:w="1594"/>
         <w:gridCol w:w="1262"/>
       </w:tblGrid>
       <w:tr>
@@ -1516,6 +1516,13 @@
               <w:t>Fecha/s incorrecta/s</w:t>
             </w:r>
           </w:p>
+          <w:p>
+            <w:pPr>
+              <w:rPr>
+                <w:lang w:val="es-ES"/>
+              </w:rPr>
+            </w:pPr>
+          </w:p>
         </w:tc>
         <w:tc>
           <w:tcPr>
@@ -1644,6 +1651,130 @@
                 <w:lang w:val="es-ES"/>
               </w:rPr>
               <w:t>FB + FA3</w:t>
+            </w:r>
+          </w:p>
+        </w:tc>
+      </w:tr>
+      <w:tr>
+        <w:tc>
+          <w:tcPr>
+            <w:tcW w:w="1252" w:type="dxa"/>
+          </w:tcPr>
+          <w:p>
+            <w:pPr>
+              <w:rPr>
+                <w:lang w:val="es-ES"/>
+              </w:rPr>
+            </w:pPr>
+            <w:r>
+              <w:rPr>
+                <w:lang w:val="es-ES"/>
+              </w:rPr>
+              <w:t>Esc-6</w:t>
+            </w:r>
+          </w:p>
+        </w:tc>
+        <w:tc>
+          <w:tcPr>
+            <w:tcW w:w="1551" w:type="dxa"/>
+          </w:tcPr>
+          <w:p>
+            <w:pPr>
+              <w:rPr>
+                <w:lang w:val="es-ES"/>
+              </w:rPr>
+            </w:pPr>
+            <w:r>
+              <w:rPr>
+                <w:lang w:val="es-ES"/>
+              </w:rPr>
+              <w:t>No hay herramientas seleccionadas</w:t>
+            </w:r>
+          </w:p>
+        </w:tc>
+        <w:tc>
+          <w:tcPr>
+            <w:tcW w:w="1262" w:type="dxa"/>
+          </w:tcPr>
+          <w:p>
+            <w:pPr>
+              <w:rPr>
+                <w:lang w:val="es-ES"/>
+              </w:rPr>
+            </w:pPr>
+            <w:r>
+              <w:rPr>
+                <w:lang w:val="es-ES"/>
+              </w:rPr>
+              <w:t>FB + FA4</w:t>
+            </w:r>
+          </w:p>
+        </w:tc>
+      </w:tr>
+      <w:tr>
+        <w:tc>
+          <w:tcPr>
+            <w:tcW w:w="1252" w:type="dxa"/>
+          </w:tcPr>
+          <w:p>
+            <w:pPr>
+              <w:rPr>
+                <w:lang w:val="es-ES"/>
+              </w:rPr>
+            </w:pPr>
+            <w:r>
+              <w:rPr>
+                <w:lang w:val="es-ES"/>
+              </w:rPr>
+              <w:t>Esc-</w:t>
+            </w:r>
+            <w:r>
+              <w:rPr>
+                <w:lang w:val="es-ES"/>
+              </w:rPr>
+              <w:t>7</w:t>
+            </w:r>
+          </w:p>
+        </w:tc>
+        <w:tc>
+          <w:tcPr>
+            <w:tcW w:w="1551" w:type="dxa"/>
+          </w:tcPr>
+          <w:p>
+            <w:pPr>
+              <w:rPr>
+                <w:lang w:val="es-ES"/>
+              </w:rPr>
+            </w:pPr>
+            <w:r>
+              <w:rPr>
+                <w:lang w:val="es-ES"/>
+              </w:rPr>
+              <w:t xml:space="preserve">Método de pago </w:t>
+            </w:r>
+            <w:r>
+              <w:rPr>
+                <w:lang w:val="es-ES"/>
+              </w:rPr>
+              <w:t>no puesto</w:t>
+            </w:r>
+          </w:p>
+        </w:tc>
+        <w:tc>
+          <w:tcPr>
+            <w:tcW w:w="1262" w:type="dxa"/>
+          </w:tcPr>
+          <w:p>
+            <w:pPr>
+              <w:rPr>
+                <w:lang w:val="es-ES"/>
+              </w:rPr>
+            </w:pPr>
+            <w:r>
+              <w:rPr>
+                <w:lang w:val="es-ES"/>
+              </w:rPr>
+              <w:t>FB + FA5</w:t>
             </w:r>
           </w:p>
         </w:tc>
@@ -1656,6 +1787,9 @@
         <w:overflowPunct w:val="0"/>
         <w:spacing w:line="500" w:lineRule="auto"/>
         <w:ind w:right="1866"/>
+        <w:rPr>
+          <w:lang w:val="es-ES"/>
+        </w:rPr>
       </w:pPr>
     </w:p>
     <w:p>
@@ -1733,11 +1867,13 @@
     </w:p>
     <w:p>
       <w:pPr>
-        <w:pStyle w:val="Ttulo1"/>
-        <w:numPr>
-          <w:ilvl w:val="0"/>
-          <w:numId w:val="0"/>
-        </w:numPr>
+        <w:rPr>
+          <w:lang w:val="es-ES"/>
+        </w:rPr>
+      </w:pPr>
+    </w:p>
+    <w:p>
+      <w:pPr>
         <w:rPr>
           <w:lang w:val="es-ES"/>
         </w:rPr>
@@ -1746,34 +1882,14 @@
     <w:p>
       <w:pPr>
         <w:pStyle w:val="Ttulo1"/>
-        <w:numPr>
-          <w:ilvl w:val="0"/>
-          <w:numId w:val="0"/>
-        </w:numPr>
         <w:rPr>
           <w:lang w:val="es-ES"/>
         </w:rPr>
       </w:pPr>
-    </w:p>
-    <w:p>
-      <w:pPr>
-        <w:rPr>
-          <w:lang w:val="es-ES"/>
-        </w:rPr>
-      </w:pPr>
-    </w:p>
-    <w:p>
-      <w:pPr>
-        <w:pStyle w:val="Ttulo1"/>
-        <w:rPr>
-          <w:lang w:val="es-ES"/>
-        </w:rPr>
-      </w:pPr>
-      <w:r>
-        <w:rPr>
-          <w:lang w:val="es-ES"/>
-        </w:rPr>
-        <w:lastRenderedPageBreak/>
+      <w:r>
+        <w:rPr>
+          <w:lang w:val="es-ES"/>
+        </w:rPr>
         <w:t>Input/Ou</w:t>
       </w:r>
       <w:r>
@@ -1812,12 +1928,12 @@
         <w:gridCol w:w="1631"/>
         <w:gridCol w:w="1113"/>
         <w:gridCol w:w="1806"/>
-        <w:gridCol w:w="1974"/>
+        <w:gridCol w:w="2085"/>
       </w:tblGrid>
       <w:tr>
         <w:tc>
           <w:tcPr>
-            <w:tcW w:w="798" w:type="dxa"/>
+            <w:tcW w:w="1011" w:type="dxa"/>
           </w:tcPr>
           <w:p>
             <w:pPr>
@@ -1839,7 +1955,7 @@
         </w:tc>
         <w:tc>
           <w:tcPr>
-            <w:tcW w:w="1411" w:type="dxa"/>
+            <w:tcW w:w="1833" w:type="dxa"/>
           </w:tcPr>
           <w:p>
             <w:pPr>
@@ -1861,7 +1977,7 @@
         </w:tc>
         <w:tc>
           <w:tcPr>
-            <w:tcW w:w="1550" w:type="dxa"/>
+            <w:tcW w:w="1748" w:type="dxa"/>
           </w:tcPr>
           <w:p>
             <w:pPr>
@@ -1883,7 +1999,7 @@
         </w:tc>
         <w:tc>
           <w:tcPr>
-            <w:tcW w:w="1449" w:type="dxa"/>
+            <w:tcW w:w="1631" w:type="dxa"/>
           </w:tcPr>
           <w:p>
             <w:pPr>
@@ -1905,7 +2021,7 @@
         </w:tc>
         <w:tc>
           <w:tcPr>
-            <w:tcW w:w="997" w:type="dxa"/>
+            <w:tcW w:w="1113" w:type="dxa"/>
           </w:tcPr>
           <w:p>
             <w:pPr>
@@ -1927,7 +2043,7 @@
         </w:tc>
         <w:tc>
           <w:tcPr>
-            <w:tcW w:w="1601" w:type="dxa"/>
+            <w:tcW w:w="1806" w:type="dxa"/>
           </w:tcPr>
           <w:p>
             <w:pPr>
@@ -1949,7 +2065,7 @@
         </w:tc>
         <w:tc>
           <w:tcPr>
-            <w:tcW w:w="1732" w:type="dxa"/>
+            <w:tcW w:w="2085" w:type="dxa"/>
           </w:tcPr>
           <w:p>
             <w:pPr>
@@ -1973,7 +2089,7 @@
       <w:tr>
         <w:tc>
           <w:tcPr>
-            <w:tcW w:w="798" w:type="dxa"/>
+            <w:tcW w:w="1011" w:type="dxa"/>
           </w:tcPr>
           <w:p>
             <w:pPr>
@@ -1991,7 +2107,7 @@
         </w:tc>
         <w:tc>
           <w:tcPr>
-            <w:tcW w:w="1411" w:type="dxa"/>
+            <w:tcW w:w="1833" w:type="dxa"/>
           </w:tcPr>
           <w:p>
             <w:pPr>
@@ -2009,7 +2125,7 @@
         </w:tc>
         <w:tc>
           <w:tcPr>
-            <w:tcW w:w="1550" w:type="dxa"/>
+            <w:tcW w:w="1748" w:type="dxa"/>
           </w:tcPr>
           <w:p>
             <w:pPr>
@@ -2027,31 +2143,31 @@
         </w:tc>
         <w:tc>
           <w:tcPr>
-            <w:tcW w:w="1449" w:type="dxa"/>
-          </w:tcPr>
-          <w:p>
-            <w:pPr>
-              <w:rPr>
-                <w:lang w:val="es-ES"/>
-              </w:rPr>
-            </w:pPr>
-          </w:p>
-        </w:tc>
-        <w:tc>
-          <w:tcPr>
-            <w:tcW w:w="997" w:type="dxa"/>
-          </w:tcPr>
-          <w:p>
-            <w:pPr>
-              <w:rPr>
-                <w:lang w:val="es-ES"/>
-              </w:rPr>
-            </w:pPr>
-          </w:p>
-        </w:tc>
-        <w:tc>
-          <w:tcPr>
-            <w:tcW w:w="1601" w:type="dxa"/>
+            <w:tcW w:w="1631" w:type="dxa"/>
+          </w:tcPr>
+          <w:p>
+            <w:pPr>
+              <w:rPr>
+                <w:lang w:val="es-ES"/>
+              </w:rPr>
+            </w:pPr>
+          </w:p>
+        </w:tc>
+        <w:tc>
+          <w:tcPr>
+            <w:tcW w:w="1113" w:type="dxa"/>
+          </w:tcPr>
+          <w:p>
+            <w:pPr>
+              <w:rPr>
+                <w:lang w:val="es-ES"/>
+              </w:rPr>
+            </w:pPr>
+          </w:p>
+        </w:tc>
+        <w:tc>
+          <w:tcPr>
+            <w:tcW w:w="1806" w:type="dxa"/>
           </w:tcPr>
           <w:p>
             <w:pPr>
@@ -2083,7 +2199,7 @@
         </w:tc>
         <w:tc>
           <w:tcPr>
-            <w:tcW w:w="1732" w:type="dxa"/>
+            <w:tcW w:w="2085" w:type="dxa"/>
           </w:tcPr>
           <w:p>
             <w:pPr>
@@ -2130,7 +2246,7 @@
       <w:tr>
         <w:tc>
           <w:tcPr>
-            <w:tcW w:w="798" w:type="dxa"/>
+            <w:tcW w:w="1011" w:type="dxa"/>
           </w:tcPr>
           <w:p>
             <w:pPr>
@@ -2148,7 +2264,7 @@
         </w:tc>
         <w:tc>
           <w:tcPr>
-            <w:tcW w:w="1411" w:type="dxa"/>
+            <w:tcW w:w="1833" w:type="dxa"/>
           </w:tcPr>
           <w:p>
             <w:pPr>
@@ -2166,7 +2282,7 @@
         </w:tc>
         <w:tc>
           <w:tcPr>
-            <w:tcW w:w="1550" w:type="dxa"/>
+            <w:tcW w:w="1748" w:type="dxa"/>
           </w:tcPr>
           <w:p>
             <w:pPr>
@@ -2184,31 +2300,31 @@
         </w:tc>
         <w:tc>
           <w:tcPr>
-            <w:tcW w:w="1449" w:type="dxa"/>
-          </w:tcPr>
-          <w:p>
-            <w:pPr>
-              <w:rPr>
-                <w:lang w:val="es-ES"/>
-              </w:rPr>
-            </w:pPr>
-          </w:p>
-        </w:tc>
-        <w:tc>
-          <w:tcPr>
-            <w:tcW w:w="997" w:type="dxa"/>
-          </w:tcPr>
-          <w:p>
-            <w:pPr>
-              <w:rPr>
-                <w:lang w:val="es-ES"/>
-              </w:rPr>
-            </w:pPr>
-          </w:p>
-        </w:tc>
-        <w:tc>
-          <w:tcPr>
-            <w:tcW w:w="1601" w:type="dxa"/>
+            <w:tcW w:w="1631" w:type="dxa"/>
+          </w:tcPr>
+          <w:p>
+            <w:pPr>
+              <w:rPr>
+                <w:lang w:val="es-ES"/>
+              </w:rPr>
+            </w:pPr>
+          </w:p>
+        </w:tc>
+        <w:tc>
+          <w:tcPr>
+            <w:tcW w:w="1113" w:type="dxa"/>
+          </w:tcPr>
+          <w:p>
+            <w:pPr>
+              <w:rPr>
+                <w:lang w:val="es-ES"/>
+              </w:rPr>
+            </w:pPr>
+          </w:p>
+        </w:tc>
+        <w:tc>
+          <w:tcPr>
+            <w:tcW w:w="1806" w:type="dxa"/>
           </w:tcPr>
           <w:p>
             <w:pPr>
@@ -2226,7 +2342,7 @@
         </w:tc>
         <w:tc>
           <w:tcPr>
-            <w:tcW w:w="1732" w:type="dxa"/>
+            <w:tcW w:w="2085" w:type="dxa"/>
           </w:tcPr>
           <w:p>
             <w:pPr>
@@ -2273,7 +2389,7 @@
       <w:tr>
         <w:tc>
           <w:tcPr>
-            <w:tcW w:w="798" w:type="dxa"/>
+            <w:tcW w:w="1011" w:type="dxa"/>
           </w:tcPr>
           <w:p>
             <w:pPr>
@@ -2291,7 +2407,7 @@
         </w:tc>
         <w:tc>
           <w:tcPr>
-            <w:tcW w:w="1411" w:type="dxa"/>
+            <w:tcW w:w="1833" w:type="dxa"/>
           </w:tcPr>
           <w:p>
             <w:pPr>
@@ -2309,7 +2425,7 @@
         </w:tc>
         <w:tc>
           <w:tcPr>
-            <w:tcW w:w="1550" w:type="dxa"/>
+            <w:tcW w:w="1748" w:type="dxa"/>
           </w:tcPr>
           <w:p>
             <w:pPr>
@@ -2327,60 +2443,68 @@
         </w:tc>
         <w:tc>
           <w:tcPr>
-            <w:tcW w:w="1449" w:type="dxa"/>
-          </w:tcPr>
-          <w:p>
-            <w:pPr>
-              <w:rPr>
-                <w:lang w:val="es-ES"/>
-              </w:rPr>
-            </w:pPr>
-          </w:p>
-        </w:tc>
-        <w:tc>
-          <w:tcPr>
-            <w:tcW w:w="997" w:type="dxa"/>
-          </w:tcPr>
-          <w:p>
-            <w:pPr>
-              <w:rPr>
-                <w:lang w:val="es-ES"/>
-              </w:rPr>
-            </w:pPr>
-          </w:p>
-        </w:tc>
-        <w:tc>
-          <w:tcPr>
-            <w:tcW w:w="1601" w:type="dxa"/>
-          </w:tcPr>
-          <w:p>
-            <w:pPr>
-              <w:rPr>
-                <w:lang w:val="es-ES"/>
-              </w:rPr>
-            </w:pPr>
-            <w:r>
-              <w:rPr>
-                <w:lang w:val="es-ES"/>
-              </w:rPr>
-              <w:t>Sergio, 11/12/2025, 26/12/2025, Efectivo, Socios “Destornillador”</w:t>
-            </w:r>
-          </w:p>
-        </w:tc>
-        <w:tc>
-          <w:tcPr>
-            <w:tcW w:w="1732" w:type="dxa"/>
-          </w:tcPr>
-          <w:p>
-            <w:pPr>
-              <w:rPr>
-                <w:lang w:val="es-ES"/>
-              </w:rPr>
-            </w:pPr>
-            <w:r>
-              <w:rPr>
-                <w:lang w:val="es-ES"/>
-              </w:rPr>
+            <w:tcW w:w="1631" w:type="dxa"/>
+          </w:tcPr>
+          <w:p>
+            <w:pPr>
+              <w:rPr>
+                <w:lang w:val="es-ES"/>
+              </w:rPr>
+            </w:pPr>
+          </w:p>
+        </w:tc>
+        <w:tc>
+          <w:tcPr>
+            <w:tcW w:w="1113" w:type="dxa"/>
+          </w:tcPr>
+          <w:p>
+            <w:pPr>
+              <w:rPr>
+                <w:lang w:val="es-ES"/>
+              </w:rPr>
+            </w:pPr>
+          </w:p>
+        </w:tc>
+        <w:tc>
+          <w:tcPr>
+            <w:tcW w:w="1806" w:type="dxa"/>
+          </w:tcPr>
+          <w:p>
+            <w:pPr>
+              <w:rPr>
+                <w:lang w:val="es-ES"/>
+              </w:rPr>
+            </w:pPr>
+            <w:r>
+              <w:rPr>
+                <w:lang w:val="es-ES"/>
+              </w:rPr>
+              <w:t xml:space="preserve">Sergio, 11/12/2025, 26/12/2025, Efectivo, Socios </w:t>
+            </w:r>
+            <w:r>
+              <w:rPr>
+                <w:lang w:val="es-ES"/>
+              </w:rPr>
+              <w:lastRenderedPageBreak/>
+              <w:t>“Destornillador”</w:t>
+            </w:r>
+          </w:p>
+        </w:tc>
+        <w:tc>
+          <w:tcPr>
+            <w:tcW w:w="2085" w:type="dxa"/>
+          </w:tcPr>
+          <w:p>
+            <w:pPr>
+              <w:rPr>
+                <w:lang w:val="es-ES"/>
+              </w:rPr>
+            </w:pPr>
+            <w:r>
+              <w:rPr>
+                <w:lang w:val="es-ES"/>
+              </w:rPr>
+              <w:lastRenderedPageBreak/>
               <w:t>“</w:t>
             </w:r>
             <w:proofErr w:type="spellStart"/>
@@ -2408,7 +2532,14 @@
               <w:rPr>
                 <w:lang w:val="es-ES"/>
               </w:rPr>
-              <w:t>9, 11/12/2025, 26/12/2025, Efectivo, Socios</w:t>
+              <w:t xml:space="preserve">9, 11/12/2025, 26/12/2025, </w:t>
+            </w:r>
+            <w:r>
+              <w:rPr>
+                <w:lang w:val="es-ES"/>
+              </w:rPr>
+              <w:lastRenderedPageBreak/>
+              <w:t>Efectivo, Socios</w:t>
             </w:r>
           </w:p>
         </w:tc>
@@ -2416,25 +2547,26 @@
       <w:tr>
         <w:tc>
           <w:tcPr>
-            <w:tcW w:w="798" w:type="dxa"/>
-          </w:tcPr>
-          <w:p>
-            <w:pPr>
-              <w:rPr>
-                <w:lang w:val="es-ES"/>
-              </w:rPr>
-            </w:pPr>
-            <w:r>
-              <w:rPr>
-                <w:lang w:val="es-ES"/>
-              </w:rPr>
+            <w:tcW w:w="1011" w:type="dxa"/>
+          </w:tcPr>
+          <w:p>
+            <w:pPr>
+              <w:rPr>
+                <w:lang w:val="es-ES"/>
+              </w:rPr>
+            </w:pPr>
+            <w:r>
+              <w:rPr>
+                <w:lang w:val="es-ES"/>
+              </w:rPr>
+              <w:lastRenderedPageBreak/>
               <w:t>CU3_4</w:t>
             </w:r>
           </w:p>
         </w:tc>
         <w:tc>
           <w:tcPr>
-            <w:tcW w:w="1411" w:type="dxa"/>
+            <w:tcW w:w="1833" w:type="dxa"/>
           </w:tcPr>
           <w:p>
             <w:pPr>
@@ -2452,7 +2584,7 @@
         </w:tc>
         <w:tc>
           <w:tcPr>
-            <w:tcW w:w="1550" w:type="dxa"/>
+            <w:tcW w:w="1748" w:type="dxa"/>
           </w:tcPr>
           <w:p>
             <w:pPr>
@@ -2470,7 +2602,7 @@
         </w:tc>
         <w:tc>
           <w:tcPr>
-            <w:tcW w:w="1449" w:type="dxa"/>
+            <w:tcW w:w="1631" w:type="dxa"/>
           </w:tcPr>
           <w:p>
             <w:pPr>
@@ -2488,31 +2620,31 @@
         </w:tc>
         <w:tc>
           <w:tcPr>
-            <w:tcW w:w="997" w:type="dxa"/>
-          </w:tcPr>
-          <w:p>
-            <w:pPr>
-              <w:rPr>
-                <w:lang w:val="es-ES"/>
-              </w:rPr>
-            </w:pPr>
-          </w:p>
-        </w:tc>
-        <w:tc>
-          <w:tcPr>
-            <w:tcW w:w="1601" w:type="dxa"/>
-          </w:tcPr>
-          <w:p>
-            <w:pPr>
-              <w:rPr>
-                <w:lang w:val="es-ES"/>
-              </w:rPr>
-            </w:pPr>
-          </w:p>
-        </w:tc>
-        <w:tc>
-          <w:tcPr>
-            <w:tcW w:w="1732" w:type="dxa"/>
+            <w:tcW w:w="1113" w:type="dxa"/>
+          </w:tcPr>
+          <w:p>
+            <w:pPr>
+              <w:rPr>
+                <w:lang w:val="es-ES"/>
+              </w:rPr>
+            </w:pPr>
+          </w:p>
+        </w:tc>
+        <w:tc>
+          <w:tcPr>
+            <w:tcW w:w="1806" w:type="dxa"/>
+          </w:tcPr>
+          <w:p>
+            <w:pPr>
+              <w:rPr>
+                <w:lang w:val="es-ES"/>
+              </w:rPr>
+            </w:pPr>
+          </w:p>
+        </w:tc>
+        <w:tc>
+          <w:tcPr>
+            <w:tcW w:w="2085" w:type="dxa"/>
           </w:tcPr>
           <w:p>
             <w:pPr>
@@ -2537,7 +2669,32 @@
               <w:rPr>
                 <w:lang w:val="es-ES"/>
               </w:rPr>
+              <w:t>{</w:t>
+            </w:r>
+            <w:r>
+              <w:rPr>
+                <w:lang w:val="es-ES"/>
+              </w:rPr>
               <w:t>Destornillador, hierro, FABRICANTE2, 12</w:t>
+            </w:r>
+            <w:r>
+              <w:rPr>
+                <w:lang w:val="es-ES"/>
+              </w:rPr>
+              <w:t>}</w:t>
+            </w:r>
+          </w:p>
+          <w:p>
+            <w:pPr>
+              <w:rPr>
+                <w:lang w:val="es-ES"/>
+              </w:rPr>
+            </w:pPr>
+            <w:r>
+              <w:rPr>
+                <w:lang w:val="es-ES"/>
+              </w:rPr>
+              <w:t>{Martillo, hierro, FABRICANTE2,15}</w:t>
             </w:r>
           </w:p>
         </w:tc>
@@ -2545,7 +2702,7 @@
       <w:tr>
         <w:tc>
           <w:tcPr>
-            <w:tcW w:w="798" w:type="dxa"/>
+            <w:tcW w:w="1011" w:type="dxa"/>
           </w:tcPr>
           <w:p>
             <w:pPr>
@@ -2563,7 +2720,7 @@
         </w:tc>
         <w:tc>
           <w:tcPr>
-            <w:tcW w:w="1411" w:type="dxa"/>
+            <w:tcW w:w="1833" w:type="dxa"/>
           </w:tcPr>
           <w:p>
             <w:pPr>
@@ -2581,7 +2738,7 @@
         </w:tc>
         <w:tc>
           <w:tcPr>
-            <w:tcW w:w="1550" w:type="dxa"/>
+            <w:tcW w:w="1748" w:type="dxa"/>
           </w:tcPr>
           <w:p>
             <w:pPr>
@@ -2599,19 +2756,19 @@
         </w:tc>
         <w:tc>
           <w:tcPr>
-            <w:tcW w:w="1449" w:type="dxa"/>
-          </w:tcPr>
-          <w:p>
-            <w:pPr>
-              <w:rPr>
-                <w:lang w:val="es-ES"/>
-              </w:rPr>
-            </w:pPr>
-          </w:p>
-        </w:tc>
-        <w:tc>
-          <w:tcPr>
-            <w:tcW w:w="997" w:type="dxa"/>
+            <w:tcW w:w="1631" w:type="dxa"/>
+          </w:tcPr>
+          <w:p>
+            <w:pPr>
+              <w:rPr>
+                <w:lang w:val="es-ES"/>
+              </w:rPr>
+            </w:pPr>
+          </w:p>
+        </w:tc>
+        <w:tc>
+          <w:tcPr>
+            <w:tcW w:w="1113" w:type="dxa"/>
           </w:tcPr>
           <w:p>
             <w:pPr>
@@ -2629,19 +2786,19 @@
         </w:tc>
         <w:tc>
           <w:tcPr>
-            <w:tcW w:w="1601" w:type="dxa"/>
-          </w:tcPr>
-          <w:p>
-            <w:pPr>
-              <w:rPr>
-                <w:lang w:val="es-ES"/>
-              </w:rPr>
-            </w:pPr>
-          </w:p>
-        </w:tc>
-        <w:tc>
-          <w:tcPr>
-            <w:tcW w:w="1732" w:type="dxa"/>
+            <w:tcW w:w="1806" w:type="dxa"/>
+          </w:tcPr>
+          <w:p>
+            <w:pPr>
+              <w:rPr>
+                <w:lang w:val="es-ES"/>
+              </w:rPr>
+            </w:pPr>
+          </w:p>
+        </w:tc>
+        <w:tc>
+          <w:tcPr>
+            <w:tcW w:w="2085" w:type="dxa"/>
           </w:tcPr>
           <w:p>
             <w:pPr>
@@ -2679,7 +2836,6 @@
               <w:rPr>
                 <w:lang w:val="es-ES"/>
               </w:rPr>
-              <w:lastRenderedPageBreak/>
               <w:t>Martillo, hierro y madera, FABRICANTE2, 12</w:t>
             </w:r>
           </w:p>
@@ -2688,26 +2844,25 @@
       <w:tr>
         <w:tc>
           <w:tcPr>
-            <w:tcW w:w="798" w:type="dxa"/>
-          </w:tcPr>
-          <w:p>
-            <w:pPr>
-              <w:rPr>
-                <w:lang w:val="es-ES"/>
-              </w:rPr>
-            </w:pPr>
-            <w:r>
-              <w:rPr>
-                <w:lang w:val="es-ES"/>
-              </w:rPr>
-              <w:lastRenderedPageBreak/>
+            <w:tcW w:w="1011" w:type="dxa"/>
+          </w:tcPr>
+          <w:p>
+            <w:pPr>
+              <w:rPr>
+                <w:lang w:val="es-ES"/>
+              </w:rPr>
+            </w:pPr>
+            <w:r>
+              <w:rPr>
+                <w:lang w:val="es-ES"/>
+              </w:rPr>
               <w:t>CU3_6</w:t>
             </w:r>
           </w:p>
         </w:tc>
         <w:tc>
           <w:tcPr>
-            <w:tcW w:w="1411" w:type="dxa"/>
+            <w:tcW w:w="1833" w:type="dxa"/>
           </w:tcPr>
           <w:p>
             <w:pPr>
@@ -2725,7 +2880,7 @@
         </w:tc>
         <w:tc>
           <w:tcPr>
-            <w:tcW w:w="1550" w:type="dxa"/>
+            <w:tcW w:w="1748" w:type="dxa"/>
           </w:tcPr>
           <w:p>
             <w:pPr>
@@ -2743,31 +2898,31 @@
         </w:tc>
         <w:tc>
           <w:tcPr>
-            <w:tcW w:w="1449" w:type="dxa"/>
-          </w:tcPr>
-          <w:p>
-            <w:pPr>
-              <w:rPr>
-                <w:lang w:val="es-ES"/>
-              </w:rPr>
-            </w:pPr>
-          </w:p>
-        </w:tc>
-        <w:tc>
-          <w:tcPr>
-            <w:tcW w:w="997" w:type="dxa"/>
-          </w:tcPr>
-          <w:p>
-            <w:pPr>
-              <w:rPr>
-                <w:lang w:val="es-ES"/>
-              </w:rPr>
-            </w:pPr>
-          </w:p>
-        </w:tc>
-        <w:tc>
-          <w:tcPr>
-            <w:tcW w:w="1601" w:type="dxa"/>
+            <w:tcW w:w="1631" w:type="dxa"/>
+          </w:tcPr>
+          <w:p>
+            <w:pPr>
+              <w:rPr>
+                <w:lang w:val="es-ES"/>
+              </w:rPr>
+            </w:pPr>
+          </w:p>
+        </w:tc>
+        <w:tc>
+          <w:tcPr>
+            <w:tcW w:w="1113" w:type="dxa"/>
+          </w:tcPr>
+          <w:p>
+            <w:pPr>
+              <w:rPr>
+                <w:lang w:val="es-ES"/>
+              </w:rPr>
+            </w:pPr>
+          </w:p>
+        </w:tc>
+        <w:tc>
+          <w:tcPr>
+            <w:tcW w:w="1806" w:type="dxa"/>
           </w:tcPr>
           <w:p>
             <w:pPr>
@@ -2785,7 +2940,7 @@
         </w:tc>
         <w:tc>
           <w:tcPr>
-            <w:tcW w:w="1732" w:type="dxa"/>
+            <w:tcW w:w="2085" w:type="dxa"/>
           </w:tcPr>
           <w:p>
             <w:pPr>
@@ -2818,7 +2973,7 @@
       <w:tr>
         <w:tc>
           <w:tcPr>
-            <w:tcW w:w="798" w:type="dxa"/>
+            <w:tcW w:w="1011" w:type="dxa"/>
           </w:tcPr>
           <w:p>
             <w:pPr>
@@ -2836,7 +2991,7 @@
         </w:tc>
         <w:tc>
           <w:tcPr>
-            <w:tcW w:w="1411" w:type="dxa"/>
+            <w:tcW w:w="1833" w:type="dxa"/>
           </w:tcPr>
           <w:p>
             <w:pPr>
@@ -2854,7 +3009,7 @@
         </w:tc>
         <w:tc>
           <w:tcPr>
-            <w:tcW w:w="1550" w:type="dxa"/>
+            <w:tcW w:w="1748" w:type="dxa"/>
           </w:tcPr>
           <w:p>
             <w:pPr>
@@ -2872,31 +3027,31 @@
         </w:tc>
         <w:tc>
           <w:tcPr>
-            <w:tcW w:w="1449" w:type="dxa"/>
-          </w:tcPr>
-          <w:p>
-            <w:pPr>
-              <w:rPr>
-                <w:lang w:val="es-ES"/>
-              </w:rPr>
-            </w:pPr>
-          </w:p>
-        </w:tc>
-        <w:tc>
-          <w:tcPr>
-            <w:tcW w:w="997" w:type="dxa"/>
-          </w:tcPr>
-          <w:p>
-            <w:pPr>
-              <w:rPr>
-                <w:lang w:val="es-ES"/>
-              </w:rPr>
-            </w:pPr>
-          </w:p>
-        </w:tc>
-        <w:tc>
-          <w:tcPr>
-            <w:tcW w:w="1601" w:type="dxa"/>
+            <w:tcW w:w="1631" w:type="dxa"/>
+          </w:tcPr>
+          <w:p>
+            <w:pPr>
+              <w:rPr>
+                <w:lang w:val="es-ES"/>
+              </w:rPr>
+            </w:pPr>
+          </w:p>
+        </w:tc>
+        <w:tc>
+          <w:tcPr>
+            <w:tcW w:w="1113" w:type="dxa"/>
+          </w:tcPr>
+          <w:p>
+            <w:pPr>
+              <w:rPr>
+                <w:lang w:val="es-ES"/>
+              </w:rPr>
+            </w:pPr>
+          </w:p>
+        </w:tc>
+        <w:tc>
+          <w:tcPr>
+            <w:tcW w:w="1806" w:type="dxa"/>
           </w:tcPr>
           <w:p>
             <w:pPr>
@@ -2914,7 +3069,7 @@
         </w:tc>
         <w:tc>
           <w:tcPr>
-            <w:tcW w:w="1732" w:type="dxa"/>
+            <w:tcW w:w="2085" w:type="dxa"/>
           </w:tcPr>
           <w:p>
             <w:pPr>
@@ -2947,7 +3102,7 @@
       <w:tr>
         <w:tc>
           <w:tcPr>
-            <w:tcW w:w="798" w:type="dxa"/>
+            <w:tcW w:w="1011" w:type="dxa"/>
           </w:tcPr>
           <w:p>
             <w:pPr>
@@ -2965,7 +3120,7 @@
         </w:tc>
         <w:tc>
           <w:tcPr>
-            <w:tcW w:w="1411" w:type="dxa"/>
+            <w:tcW w:w="1833" w:type="dxa"/>
           </w:tcPr>
           <w:p>
             <w:pPr>
@@ -2983,7 +3138,7 @@
         </w:tc>
         <w:tc>
           <w:tcPr>
-            <w:tcW w:w="1550" w:type="dxa"/>
+            <w:tcW w:w="1748" w:type="dxa"/>
           </w:tcPr>
           <w:p>
             <w:pPr>
@@ -3001,31 +3156,31 @@
         </w:tc>
         <w:tc>
           <w:tcPr>
-            <w:tcW w:w="1449" w:type="dxa"/>
-          </w:tcPr>
-          <w:p>
-            <w:pPr>
-              <w:rPr>
-                <w:lang w:val="es-ES"/>
-              </w:rPr>
-            </w:pPr>
-          </w:p>
-        </w:tc>
-        <w:tc>
-          <w:tcPr>
-            <w:tcW w:w="997" w:type="dxa"/>
-          </w:tcPr>
-          <w:p>
-            <w:pPr>
-              <w:rPr>
-                <w:lang w:val="es-ES"/>
-              </w:rPr>
-            </w:pPr>
-          </w:p>
-        </w:tc>
-        <w:tc>
-          <w:tcPr>
-            <w:tcW w:w="1601" w:type="dxa"/>
+            <w:tcW w:w="1631" w:type="dxa"/>
+          </w:tcPr>
+          <w:p>
+            <w:pPr>
+              <w:rPr>
+                <w:lang w:val="es-ES"/>
+              </w:rPr>
+            </w:pPr>
+          </w:p>
+        </w:tc>
+        <w:tc>
+          <w:tcPr>
+            <w:tcW w:w="1113" w:type="dxa"/>
+          </w:tcPr>
+          <w:p>
+            <w:pPr>
+              <w:rPr>
+                <w:lang w:val="es-ES"/>
+              </w:rPr>
+            </w:pPr>
+          </w:p>
+        </w:tc>
+        <w:tc>
+          <w:tcPr>
+            <w:tcW w:w="1806" w:type="dxa"/>
           </w:tcPr>
           <w:p>
             <w:pPr>
@@ -3043,7 +3198,7 @@
         </w:tc>
         <w:tc>
           <w:tcPr>
-            <w:tcW w:w="1732" w:type="dxa"/>
+            <w:tcW w:w="2085" w:type="dxa"/>
           </w:tcPr>
           <w:p>
             <w:pPr>
@@ -3082,7 +3237,7 @@
       <w:tr>
         <w:tc>
           <w:tcPr>
-            <w:tcW w:w="798" w:type="dxa"/>
+            <w:tcW w:w="1011" w:type="dxa"/>
           </w:tcPr>
           <w:p>
             <w:pPr>
@@ -3100,7 +3255,7 @@
         </w:tc>
         <w:tc>
           <w:tcPr>
-            <w:tcW w:w="1411" w:type="dxa"/>
+            <w:tcW w:w="1833" w:type="dxa"/>
           </w:tcPr>
           <w:p>
             <w:pPr>
@@ -3118,7 +3273,7 @@
         </w:tc>
         <w:tc>
           <w:tcPr>
-            <w:tcW w:w="1550" w:type="dxa"/>
+            <w:tcW w:w="1748" w:type="dxa"/>
           </w:tcPr>
           <w:p>
             <w:pPr>
@@ -3136,31 +3291,31 @@
         </w:tc>
         <w:tc>
           <w:tcPr>
-            <w:tcW w:w="1449" w:type="dxa"/>
-          </w:tcPr>
-          <w:p>
-            <w:pPr>
-              <w:rPr>
-                <w:lang w:val="es-ES"/>
-              </w:rPr>
-            </w:pPr>
-          </w:p>
-        </w:tc>
-        <w:tc>
-          <w:tcPr>
-            <w:tcW w:w="997" w:type="dxa"/>
-          </w:tcPr>
-          <w:p>
-            <w:pPr>
-              <w:rPr>
-                <w:lang w:val="es-ES"/>
-              </w:rPr>
-            </w:pPr>
-          </w:p>
-        </w:tc>
-        <w:tc>
-          <w:tcPr>
-            <w:tcW w:w="1601" w:type="dxa"/>
+            <w:tcW w:w="1631" w:type="dxa"/>
+          </w:tcPr>
+          <w:p>
+            <w:pPr>
+              <w:rPr>
+                <w:lang w:val="es-ES"/>
+              </w:rPr>
+            </w:pPr>
+          </w:p>
+        </w:tc>
+        <w:tc>
+          <w:tcPr>
+            <w:tcW w:w="1113" w:type="dxa"/>
+          </w:tcPr>
+          <w:p>
+            <w:pPr>
+              <w:rPr>
+                <w:lang w:val="es-ES"/>
+              </w:rPr>
+            </w:pPr>
+          </w:p>
+        </w:tc>
+        <w:tc>
+          <w:tcPr>
+            <w:tcW w:w="1806" w:type="dxa"/>
           </w:tcPr>
           <w:p>
             <w:pPr>
@@ -3217,7 +3372,7 @@
         </w:tc>
         <w:tc>
           <w:tcPr>
-            <w:tcW w:w="1732" w:type="dxa"/>
+            <w:tcW w:w="2085" w:type="dxa"/>
           </w:tcPr>
           <w:p>
             <w:pPr>
@@ -3237,25 +3392,26 @@
       <w:tr>
         <w:tc>
           <w:tcPr>
-            <w:tcW w:w="798" w:type="dxa"/>
-          </w:tcPr>
-          <w:p>
-            <w:pPr>
-              <w:rPr>
-                <w:lang w:val="es-ES"/>
-              </w:rPr>
-            </w:pPr>
-            <w:r>
-              <w:rPr>
-                <w:lang w:val="es-ES"/>
-              </w:rPr>
+            <w:tcW w:w="1011" w:type="dxa"/>
+          </w:tcPr>
+          <w:p>
+            <w:pPr>
+              <w:rPr>
+                <w:lang w:val="es-ES"/>
+              </w:rPr>
+            </w:pPr>
+            <w:r>
+              <w:rPr>
+                <w:lang w:val="es-ES"/>
+              </w:rPr>
+              <w:lastRenderedPageBreak/>
               <w:t>CU3_10</w:t>
             </w:r>
           </w:p>
         </w:tc>
         <w:tc>
           <w:tcPr>
-            <w:tcW w:w="1411" w:type="dxa"/>
+            <w:tcW w:w="1833" w:type="dxa"/>
           </w:tcPr>
           <w:p>
             <w:pPr>
@@ -3279,7 +3435,7 @@
         </w:tc>
         <w:tc>
           <w:tcPr>
-            <w:tcW w:w="1550" w:type="dxa"/>
+            <w:tcW w:w="1748" w:type="dxa"/>
           </w:tcPr>
           <w:p>
             <w:pPr>
@@ -3297,31 +3453,31 @@
         </w:tc>
         <w:tc>
           <w:tcPr>
-            <w:tcW w:w="1449" w:type="dxa"/>
-          </w:tcPr>
-          <w:p>
-            <w:pPr>
-              <w:rPr>
-                <w:lang w:val="es-ES"/>
-              </w:rPr>
-            </w:pPr>
-          </w:p>
-        </w:tc>
-        <w:tc>
-          <w:tcPr>
-            <w:tcW w:w="997" w:type="dxa"/>
-          </w:tcPr>
-          <w:p>
-            <w:pPr>
-              <w:rPr>
-                <w:lang w:val="es-ES"/>
-              </w:rPr>
-            </w:pPr>
-          </w:p>
-        </w:tc>
-        <w:tc>
-          <w:tcPr>
-            <w:tcW w:w="1601" w:type="dxa"/>
+            <w:tcW w:w="1631" w:type="dxa"/>
+          </w:tcPr>
+          <w:p>
+            <w:pPr>
+              <w:rPr>
+                <w:lang w:val="es-ES"/>
+              </w:rPr>
+            </w:pPr>
+          </w:p>
+        </w:tc>
+        <w:tc>
+          <w:tcPr>
+            <w:tcW w:w="1113" w:type="dxa"/>
+          </w:tcPr>
+          <w:p>
+            <w:pPr>
+              <w:rPr>
+                <w:lang w:val="es-ES"/>
+              </w:rPr>
+            </w:pPr>
+          </w:p>
+        </w:tc>
+        <w:tc>
+          <w:tcPr>
+            <w:tcW w:w="1806" w:type="dxa"/>
           </w:tcPr>
           <w:p>
             <w:pPr>
@@ -3339,7 +3495,7 @@
         </w:tc>
         <w:tc>
           <w:tcPr>
-            <w:tcW w:w="1732" w:type="dxa"/>
+            <w:tcW w:w="2085" w:type="dxa"/>
           </w:tcPr>
           <w:p>
             <w:pPr>
@@ -3365,6 +3521,317 @@
                 <w:lang w:val="es-ES"/>
               </w:rPr>
               <w:t xml:space="preserve">“Destornillador”, se modifica automáticamente a un porcentaje válido 100% de rebaja </w:t>
+            </w:r>
+          </w:p>
+        </w:tc>
+      </w:tr>
+      <w:tr>
+        <w:tc>
+          <w:tcPr>
+            <w:tcW w:w="1011" w:type="dxa"/>
+          </w:tcPr>
+          <w:p>
+            <w:pPr>
+              <w:rPr>
+                <w:lang w:val="es-ES"/>
+              </w:rPr>
+            </w:pPr>
+            <w:r>
+              <w:rPr>
+                <w:lang w:val="es-ES"/>
+              </w:rPr>
+              <w:t>CU3_11</w:t>
+            </w:r>
+          </w:p>
+        </w:tc>
+        <w:tc>
+          <w:tcPr>
+            <w:tcW w:w="1833" w:type="dxa"/>
+          </w:tcPr>
+          <w:p>
+            <w:pPr>
+              <w:rPr>
+                <w:lang w:val="es-ES"/>
+              </w:rPr>
+            </w:pPr>
+            <w:r>
+              <w:rPr>
+                <w:lang w:val="es-ES"/>
+              </w:rPr>
+              <w:t>Esc6/</w:t>
+            </w:r>
+            <w:r>
+              <w:rPr>
+                <w:lang w:val="es-ES"/>
+              </w:rPr>
+              <w:t>No hay herramientas seleccionadas</w:t>
+            </w:r>
+          </w:p>
+        </w:tc>
+        <w:tc>
+          <w:tcPr>
+            <w:tcW w:w="1748" w:type="dxa"/>
+          </w:tcPr>
+          <w:p>
+            <w:pPr>
+              <w:rPr>
+                <w:lang w:val="es-ES"/>
+              </w:rPr>
+            </w:pPr>
+            <w:r>
+              <w:rPr>
+                <w:lang w:val="es-ES"/>
+              </w:rPr>
+              <w:t>Lista de herramientas disponibles</w:t>
+            </w:r>
+          </w:p>
+        </w:tc>
+        <w:tc>
+          <w:tcPr>
+            <w:tcW w:w="1631" w:type="dxa"/>
+          </w:tcPr>
+          <w:p>
+            <w:pPr>
+              <w:rPr>
+                <w:lang w:val="es-ES"/>
+              </w:rPr>
+            </w:pPr>
+          </w:p>
+        </w:tc>
+        <w:tc>
+          <w:tcPr>
+            <w:tcW w:w="1113" w:type="dxa"/>
+          </w:tcPr>
+          <w:p>
+            <w:pPr>
+              <w:rPr>
+                <w:lang w:val="es-ES"/>
+              </w:rPr>
+            </w:pPr>
+          </w:p>
+        </w:tc>
+        <w:tc>
+          <w:tcPr>
+            <w:tcW w:w="1806" w:type="dxa"/>
+          </w:tcPr>
+          <w:p>
+            <w:pPr>
+              <w:rPr>
+                <w:lang w:val="es-ES"/>
+              </w:rPr>
+            </w:pPr>
+            <w:r>
+              <w:rPr>
+                <w:lang w:val="es-ES"/>
+              </w:rPr>
+              <w:t>Seleccionado: nada</w:t>
+            </w:r>
+          </w:p>
+        </w:tc>
+        <w:tc>
+          <w:tcPr>
+            <w:tcW w:w="2085" w:type="dxa"/>
+          </w:tcPr>
+          <w:p>
+            <w:pPr>
+              <w:rPr>
+                <w:lang w:val="es-ES"/>
+              </w:rPr>
+            </w:pPr>
+            <w:r>
+              <w:rPr>
+                <w:lang w:val="es-ES"/>
+              </w:rPr>
+              <w:t>Mostrado: No aparece el botón de hacer oferta</w:t>
+            </w:r>
+          </w:p>
+        </w:tc>
+      </w:tr>
+      <w:tr>
+        <w:tc>
+          <w:tcPr>
+            <w:tcW w:w="1011" w:type="dxa"/>
+          </w:tcPr>
+          <w:p>
+            <w:pPr>
+              <w:rPr>
+                <w:lang w:val="es-ES"/>
+              </w:rPr>
+            </w:pPr>
+            <w:r>
+              <w:rPr>
+                <w:lang w:val="es-ES"/>
+              </w:rPr>
+              <w:t>CU3_1</w:t>
+            </w:r>
+            <w:r>
+              <w:rPr>
+                <w:lang w:val="es-ES"/>
+              </w:rPr>
+              <w:t>2</w:t>
+            </w:r>
+          </w:p>
+        </w:tc>
+        <w:tc>
+          <w:tcPr>
+            <w:tcW w:w="1833" w:type="dxa"/>
+          </w:tcPr>
+          <w:p>
+            <w:pPr>
+              <w:rPr>
+                <w:lang w:val="es-ES"/>
+              </w:rPr>
+            </w:pPr>
+            <w:r>
+              <w:rPr>
+                <w:lang w:val="es-ES"/>
+              </w:rPr>
+              <w:t>Esc</w:t>
+            </w:r>
+            <w:r>
+              <w:rPr>
+                <w:lang w:val="es-ES"/>
+              </w:rPr>
+              <w:t>7</w:t>
+            </w:r>
+            <w:r>
+              <w:rPr>
+                <w:lang w:val="es-ES"/>
+              </w:rPr>
+              <w:t xml:space="preserve">/Método de pago </w:t>
+            </w:r>
+            <w:r>
+              <w:rPr>
+                <w:lang w:val="es-ES"/>
+              </w:rPr>
+              <w:t>erróneo</w:t>
+            </w:r>
+          </w:p>
+        </w:tc>
+        <w:tc>
+          <w:tcPr>
+            <w:tcW w:w="1748" w:type="dxa"/>
+          </w:tcPr>
+          <w:p>
+            <w:pPr>
+              <w:rPr>
+                <w:lang w:val="es-ES"/>
+              </w:rPr>
+            </w:pPr>
+            <w:r>
+              <w:rPr>
+                <w:lang w:val="es-ES"/>
+              </w:rPr>
+              <w:t>Lista de herramientas disponibles</w:t>
+            </w:r>
+          </w:p>
+        </w:tc>
+        <w:tc>
+          <w:tcPr>
+            <w:tcW w:w="1631" w:type="dxa"/>
+          </w:tcPr>
+          <w:p>
+            <w:pPr>
+              <w:rPr>
+                <w:lang w:val="es-ES"/>
+              </w:rPr>
+            </w:pPr>
+          </w:p>
+        </w:tc>
+        <w:tc>
+          <w:tcPr>
+            <w:tcW w:w="1113" w:type="dxa"/>
+          </w:tcPr>
+          <w:p>
+            <w:pPr>
+              <w:rPr>
+                <w:lang w:val="es-ES"/>
+              </w:rPr>
+            </w:pPr>
+          </w:p>
+        </w:tc>
+        <w:tc>
+          <w:tcPr>
+            <w:tcW w:w="1806" w:type="dxa"/>
+          </w:tcPr>
+          <w:p>
+            <w:pPr>
+              <w:rPr>
+                <w:lang w:val="es-ES"/>
+              </w:rPr>
+            </w:pPr>
+            <w:r>
+              <w:rPr>
+                <w:lang w:val="es-ES"/>
+              </w:rPr>
+              <w:t xml:space="preserve">Sergio, 11/12/2025, </w:t>
+            </w:r>
+            <w:r>
+              <w:rPr>
+                <w:lang w:val="es-ES"/>
+              </w:rPr>
+              <w:t>29</w:t>
+            </w:r>
+            <w:r>
+              <w:rPr>
+                <w:lang w:val="es-ES"/>
+              </w:rPr>
+              <w:t xml:space="preserve">/12/2025, </w:t>
+            </w:r>
+            <w:r>
+              <w:rPr>
+                <w:lang w:val="es-ES"/>
+              </w:rPr>
+              <w:t>NULL</w:t>
+            </w:r>
+            <w:r>
+              <w:rPr>
+                <w:lang w:val="es-ES"/>
+              </w:rPr>
+              <w:t>, Socios “Destornillador”</w:t>
+            </w:r>
+          </w:p>
+        </w:tc>
+        <w:tc>
+          <w:tcPr>
+            <w:tcW w:w="2085" w:type="dxa"/>
+          </w:tcPr>
+          <w:p>
+            <w:pPr>
+              <w:rPr>
+                <w:lang w:val="es-ES"/>
+              </w:rPr>
+            </w:pPr>
+            <w:r>
+              <w:rPr>
+                <w:lang w:val="es-ES"/>
+              </w:rPr>
+              <w:t>ERROR</w:t>
+            </w:r>
+          </w:p>
+          <w:p>
+            <w:pPr>
+              <w:rPr>
+                <w:lang w:val="es-ES"/>
+              </w:rPr>
+            </w:pPr>
+            <w:r>
+              <w:rPr>
+                <w:lang w:val="es-ES"/>
+              </w:rPr>
+              <w:t xml:space="preserve">"Falta un </w:t>
+            </w:r>
+            <w:r>
+              <w:rPr>
+                <w:lang w:val="es-ES"/>
+              </w:rPr>
+              <w:t>método</w:t>
+            </w:r>
+            <w:r>
+              <w:rPr>
+                <w:lang w:val="es-ES"/>
+              </w:rPr>
+              <w:t xml:space="preserve"> de pago válido"</w:t>
             </w:r>
           </w:p>
         </w:tc>
@@ -3476,7 +3943,6 @@
         <w:rPr>
           <w:lang w:val="es-ES"/>
         </w:rPr>
-        <w:lastRenderedPageBreak/>
         <w:t>Software</w:t>
       </w:r>
       <w:bookmarkEnd w:id="6"/>
@@ -3637,11 +4103,15 @@
       <w:pPr>
         <w:ind w:left="708"/>
         <w:rPr>
+          <w:sz w:val="30"/>
+          <w:szCs w:val="30"/>
           <w:lang w:val="es-ES"/>
         </w:rPr>
       </w:pPr>
       <w:r>
         <w:rPr>
+          <w:sz w:val="30"/>
+          <w:szCs w:val="30"/>
           <w:lang w:val="es-ES"/>
         </w:rPr>
         <w:t xml:space="preserve">Antes de correr todas las pruebas funcionales aplicar los archivos dentro de la API y la carpeta BBDD, </w:t>
@@ -3649,6 +4119,8 @@
       <w:proofErr w:type="spellStart"/>
       <w:r>
         <w:rPr>
+          <w:sz w:val="30"/>
+          <w:szCs w:val="30"/>
           <w:lang w:val="es-ES"/>
         </w:rPr>
         <w:t>dbo.AspNetUsers.data.sql</w:t>
@@ -3656,6 +4128,8 @@
       <w:proofErr w:type="spellEnd"/>
       <w:r>
         <w:rPr>
+          <w:sz w:val="30"/>
+          <w:szCs w:val="30"/>
           <w:lang w:val="es-ES"/>
         </w:rPr>
         <w:t xml:space="preserve"> y </w:t>
@@ -3663,6 +4137,8 @@
       <w:proofErr w:type="spellStart"/>
       <w:r>
         <w:rPr>
+          <w:sz w:val="30"/>
+          <w:szCs w:val="30"/>
           <w:lang w:val="es-ES"/>
         </w:rPr>
         <w:t>dbo.herramientasyFabricantesOFERTA.data.sql</w:t>
@@ -3670,6 +4146,8 @@
       <w:proofErr w:type="spellEnd"/>
       <w:r>
         <w:rPr>
+          <w:sz w:val="30"/>
+          <w:szCs w:val="30"/>
           <w:lang w:val="es-ES"/>
         </w:rPr>
         <w:t>.</w:t>
@@ -4925,7 +5403,6 @@
   <w:style w:type="character" w:default="1" w:styleId="Fuentedeprrafopredeter">
     <w:name w:val="Default Paragraph Font"/>
     <w:uiPriority w:val="1"/>
-    <w:semiHidden/>
     <w:unhideWhenUsed/>
   </w:style>
   <w:style w:type="table" w:default="1" w:styleId="Tablanormal">
@@ -5607,6 +6084,15 @@
 </file>
 
 <file path=customXml/item1.xml><?xml version="1.0" encoding="utf-8"?>
+<?mso-contentType ?>
+<FormTemplates xmlns="http://schemas.microsoft.com/sharepoint/v3/contenttype/forms">
+  <Display>DocumentLibraryForm</Display>
+  <Edit>DocumentLibraryForm</Edit>
+  <New>DocumentLibraryForm</New>
+</FormTemplates>
+</file>
+
+<file path=customXml/item2.xml><?xml version="1.0" encoding="utf-8"?>
 <p:properties xmlns:p="http://schemas.microsoft.com/office/2006/metadata/properties" xmlns:xsi="http://www.w3.org/2001/XMLSchema-instance" xmlns:pc="http://schemas.microsoft.com/office/infopath/2007/PartnerControls">
   <documentManagement>
     <TaxCatchAll xmlns="e70db583-0384-45f2-bee4-d71087a4ae97" xsi:nil="true"/>
@@ -5615,15 +6101,6 @@
     </lcf76f155ced4ddcb4097134ff3c332f>
   </documentManagement>
 </p:properties>
-</file>
-
-<file path=customXml/item2.xml><?xml version="1.0" encoding="utf-8"?>
-<?mso-contentType ?>
-<FormTemplates xmlns="http://schemas.microsoft.com/sharepoint/v3/contenttype/forms">
-  <Display>DocumentLibraryForm</Display>
-  <Edit>DocumentLibraryForm</Edit>
-  <New>DocumentLibraryForm</New>
-</FormTemplates>
 </file>
 
 <file path=customXml/item3.xml><?xml version="1.0" encoding="utf-8"?>
@@ -5870,20 +6347,20 @@
 </file>
 
 <file path=customXml/itemProps1.xml><?xml version="1.0" encoding="utf-8"?>
+<ds:datastoreItem xmlns:ds="http://schemas.openxmlformats.org/officeDocument/2006/customXml" ds:itemID="{396B05A9-87A0-4E80-9F96-F1F0943B6178}">
+  <ds:schemaRefs>
+    <ds:schemaRef ds:uri="http://schemas.microsoft.com/sharepoint/v3/contenttype/forms"/>
+  </ds:schemaRefs>
+</ds:datastoreItem>
+</file>
+
+<file path=customXml/itemProps2.xml><?xml version="1.0" encoding="utf-8"?>
 <ds:datastoreItem xmlns:ds="http://schemas.openxmlformats.org/officeDocument/2006/customXml" ds:itemID="{1E552648-2456-4AEB-9337-C6642FAB7968}">
   <ds:schemaRefs>
     <ds:schemaRef ds:uri="http://schemas.microsoft.com/office/2006/metadata/properties"/>
     <ds:schemaRef ds:uri="http://schemas.microsoft.com/office/infopath/2007/PartnerControls"/>
     <ds:schemaRef ds:uri="e70db583-0384-45f2-bee4-d71087a4ae97"/>
     <ds:schemaRef ds:uri="d6169a53-58c7-4834-a922-92accc0d3c74"/>
-  </ds:schemaRefs>
-</ds:datastoreItem>
-</file>
-
-<file path=customXml/itemProps2.xml><?xml version="1.0" encoding="utf-8"?>
-<ds:datastoreItem xmlns:ds="http://schemas.openxmlformats.org/officeDocument/2006/customXml" ds:itemID="{396B05A9-87A0-4E80-9F96-F1F0943B6178}">
-  <ds:schemaRefs>
-    <ds:schemaRef ds:uri="http://schemas.microsoft.com/sharepoint/v3/contenttype/forms"/>
   </ds:schemaRefs>
 </ds:datastoreItem>
 </file>

</xml_diff>

<commit_message>
Me faltaban los flujos alternativos 4 y 5 por cubrir. (#135)
</commit_message>
<xml_diff>
--- a/test/AppForSEII2526.UIT/CU_Oferta/TC_CU_Oferta.docx
+++ b/test/AppForSEII2526.UIT/CU_Oferta/TC_CU_Oferta.docx
@@ -1309,7 +1309,7 @@
       </w:tblPr>
       <w:tblGrid>
         <w:gridCol w:w="1252"/>
-        <w:gridCol w:w="1551"/>
+        <w:gridCol w:w="1594"/>
         <w:gridCol w:w="1262"/>
       </w:tblGrid>
       <w:tr>
@@ -1516,6 +1516,13 @@
               <w:t>Fecha/s incorrecta/s</w:t>
             </w:r>
           </w:p>
+          <w:p>
+            <w:pPr>
+              <w:rPr>
+                <w:lang w:val="es-ES"/>
+              </w:rPr>
+            </w:pPr>
+          </w:p>
         </w:tc>
         <w:tc>
           <w:tcPr>
@@ -1644,6 +1651,130 @@
                 <w:lang w:val="es-ES"/>
               </w:rPr>
               <w:t>FB + FA3</w:t>
+            </w:r>
+          </w:p>
+        </w:tc>
+      </w:tr>
+      <w:tr>
+        <w:tc>
+          <w:tcPr>
+            <w:tcW w:w="1252" w:type="dxa"/>
+          </w:tcPr>
+          <w:p>
+            <w:pPr>
+              <w:rPr>
+                <w:lang w:val="es-ES"/>
+              </w:rPr>
+            </w:pPr>
+            <w:r>
+              <w:rPr>
+                <w:lang w:val="es-ES"/>
+              </w:rPr>
+              <w:t>Esc-6</w:t>
+            </w:r>
+          </w:p>
+        </w:tc>
+        <w:tc>
+          <w:tcPr>
+            <w:tcW w:w="1551" w:type="dxa"/>
+          </w:tcPr>
+          <w:p>
+            <w:pPr>
+              <w:rPr>
+                <w:lang w:val="es-ES"/>
+              </w:rPr>
+            </w:pPr>
+            <w:r>
+              <w:rPr>
+                <w:lang w:val="es-ES"/>
+              </w:rPr>
+              <w:t>No hay herramientas seleccionadas</w:t>
+            </w:r>
+          </w:p>
+        </w:tc>
+        <w:tc>
+          <w:tcPr>
+            <w:tcW w:w="1262" w:type="dxa"/>
+          </w:tcPr>
+          <w:p>
+            <w:pPr>
+              <w:rPr>
+                <w:lang w:val="es-ES"/>
+              </w:rPr>
+            </w:pPr>
+            <w:r>
+              <w:rPr>
+                <w:lang w:val="es-ES"/>
+              </w:rPr>
+              <w:t>FB + FA4</w:t>
+            </w:r>
+          </w:p>
+        </w:tc>
+      </w:tr>
+      <w:tr>
+        <w:tc>
+          <w:tcPr>
+            <w:tcW w:w="1252" w:type="dxa"/>
+          </w:tcPr>
+          <w:p>
+            <w:pPr>
+              <w:rPr>
+                <w:lang w:val="es-ES"/>
+              </w:rPr>
+            </w:pPr>
+            <w:r>
+              <w:rPr>
+                <w:lang w:val="es-ES"/>
+              </w:rPr>
+              <w:t>Esc-</w:t>
+            </w:r>
+            <w:r>
+              <w:rPr>
+                <w:lang w:val="es-ES"/>
+              </w:rPr>
+              <w:t>7</w:t>
+            </w:r>
+          </w:p>
+        </w:tc>
+        <w:tc>
+          <w:tcPr>
+            <w:tcW w:w="1551" w:type="dxa"/>
+          </w:tcPr>
+          <w:p>
+            <w:pPr>
+              <w:rPr>
+                <w:lang w:val="es-ES"/>
+              </w:rPr>
+            </w:pPr>
+            <w:r>
+              <w:rPr>
+                <w:lang w:val="es-ES"/>
+              </w:rPr>
+              <w:t xml:space="preserve">Método de pago </w:t>
+            </w:r>
+            <w:r>
+              <w:rPr>
+                <w:lang w:val="es-ES"/>
+              </w:rPr>
+              <w:t>no puesto</w:t>
+            </w:r>
+          </w:p>
+        </w:tc>
+        <w:tc>
+          <w:tcPr>
+            <w:tcW w:w="1262" w:type="dxa"/>
+          </w:tcPr>
+          <w:p>
+            <w:pPr>
+              <w:rPr>
+                <w:lang w:val="es-ES"/>
+              </w:rPr>
+            </w:pPr>
+            <w:r>
+              <w:rPr>
+                <w:lang w:val="es-ES"/>
+              </w:rPr>
+              <w:t>FB + FA5</w:t>
             </w:r>
           </w:p>
         </w:tc>
@@ -1656,6 +1787,9 @@
         <w:overflowPunct w:val="0"/>
         <w:spacing w:line="500" w:lineRule="auto"/>
         <w:ind w:right="1866"/>
+        <w:rPr>
+          <w:lang w:val="es-ES"/>
+        </w:rPr>
       </w:pPr>
     </w:p>
     <w:p>
@@ -1733,11 +1867,13 @@
     </w:p>
     <w:p>
       <w:pPr>
-        <w:pStyle w:val="Ttulo1"/>
-        <w:numPr>
-          <w:ilvl w:val="0"/>
-          <w:numId w:val="0"/>
-        </w:numPr>
+        <w:rPr>
+          <w:lang w:val="es-ES"/>
+        </w:rPr>
+      </w:pPr>
+    </w:p>
+    <w:p>
+      <w:pPr>
         <w:rPr>
           <w:lang w:val="es-ES"/>
         </w:rPr>
@@ -1746,34 +1882,14 @@
     <w:p>
       <w:pPr>
         <w:pStyle w:val="Ttulo1"/>
-        <w:numPr>
-          <w:ilvl w:val="0"/>
-          <w:numId w:val="0"/>
-        </w:numPr>
         <w:rPr>
           <w:lang w:val="es-ES"/>
         </w:rPr>
       </w:pPr>
-    </w:p>
-    <w:p>
-      <w:pPr>
-        <w:rPr>
-          <w:lang w:val="es-ES"/>
-        </w:rPr>
-      </w:pPr>
-    </w:p>
-    <w:p>
-      <w:pPr>
-        <w:pStyle w:val="Ttulo1"/>
-        <w:rPr>
-          <w:lang w:val="es-ES"/>
-        </w:rPr>
-      </w:pPr>
-      <w:r>
-        <w:rPr>
-          <w:lang w:val="es-ES"/>
-        </w:rPr>
-        <w:lastRenderedPageBreak/>
+      <w:r>
+        <w:rPr>
+          <w:lang w:val="es-ES"/>
+        </w:rPr>
         <w:t>Input/Ou</w:t>
       </w:r>
       <w:r>
@@ -1812,12 +1928,12 @@
         <w:gridCol w:w="1631"/>
         <w:gridCol w:w="1113"/>
         <w:gridCol w:w="1806"/>
-        <w:gridCol w:w="1974"/>
+        <w:gridCol w:w="2085"/>
       </w:tblGrid>
       <w:tr>
         <w:tc>
           <w:tcPr>
-            <w:tcW w:w="798" w:type="dxa"/>
+            <w:tcW w:w="1011" w:type="dxa"/>
           </w:tcPr>
           <w:p>
             <w:pPr>
@@ -1839,7 +1955,7 @@
         </w:tc>
         <w:tc>
           <w:tcPr>
-            <w:tcW w:w="1411" w:type="dxa"/>
+            <w:tcW w:w="1833" w:type="dxa"/>
           </w:tcPr>
           <w:p>
             <w:pPr>
@@ -1861,7 +1977,7 @@
         </w:tc>
         <w:tc>
           <w:tcPr>
-            <w:tcW w:w="1550" w:type="dxa"/>
+            <w:tcW w:w="1748" w:type="dxa"/>
           </w:tcPr>
           <w:p>
             <w:pPr>
@@ -1883,7 +1999,7 @@
         </w:tc>
         <w:tc>
           <w:tcPr>
-            <w:tcW w:w="1449" w:type="dxa"/>
+            <w:tcW w:w="1631" w:type="dxa"/>
           </w:tcPr>
           <w:p>
             <w:pPr>
@@ -1905,7 +2021,7 @@
         </w:tc>
         <w:tc>
           <w:tcPr>
-            <w:tcW w:w="997" w:type="dxa"/>
+            <w:tcW w:w="1113" w:type="dxa"/>
           </w:tcPr>
           <w:p>
             <w:pPr>
@@ -1927,7 +2043,7 @@
         </w:tc>
         <w:tc>
           <w:tcPr>
-            <w:tcW w:w="1601" w:type="dxa"/>
+            <w:tcW w:w="1806" w:type="dxa"/>
           </w:tcPr>
           <w:p>
             <w:pPr>
@@ -1949,7 +2065,7 @@
         </w:tc>
         <w:tc>
           <w:tcPr>
-            <w:tcW w:w="1732" w:type="dxa"/>
+            <w:tcW w:w="2085" w:type="dxa"/>
           </w:tcPr>
           <w:p>
             <w:pPr>
@@ -1973,7 +2089,7 @@
       <w:tr>
         <w:tc>
           <w:tcPr>
-            <w:tcW w:w="798" w:type="dxa"/>
+            <w:tcW w:w="1011" w:type="dxa"/>
           </w:tcPr>
           <w:p>
             <w:pPr>
@@ -1991,7 +2107,7 @@
         </w:tc>
         <w:tc>
           <w:tcPr>
-            <w:tcW w:w="1411" w:type="dxa"/>
+            <w:tcW w:w="1833" w:type="dxa"/>
           </w:tcPr>
           <w:p>
             <w:pPr>
@@ -2009,7 +2125,7 @@
         </w:tc>
         <w:tc>
           <w:tcPr>
-            <w:tcW w:w="1550" w:type="dxa"/>
+            <w:tcW w:w="1748" w:type="dxa"/>
           </w:tcPr>
           <w:p>
             <w:pPr>
@@ -2027,31 +2143,31 @@
         </w:tc>
         <w:tc>
           <w:tcPr>
-            <w:tcW w:w="1449" w:type="dxa"/>
-          </w:tcPr>
-          <w:p>
-            <w:pPr>
-              <w:rPr>
-                <w:lang w:val="es-ES"/>
-              </w:rPr>
-            </w:pPr>
-          </w:p>
-        </w:tc>
-        <w:tc>
-          <w:tcPr>
-            <w:tcW w:w="997" w:type="dxa"/>
-          </w:tcPr>
-          <w:p>
-            <w:pPr>
-              <w:rPr>
-                <w:lang w:val="es-ES"/>
-              </w:rPr>
-            </w:pPr>
-          </w:p>
-        </w:tc>
-        <w:tc>
-          <w:tcPr>
-            <w:tcW w:w="1601" w:type="dxa"/>
+            <w:tcW w:w="1631" w:type="dxa"/>
+          </w:tcPr>
+          <w:p>
+            <w:pPr>
+              <w:rPr>
+                <w:lang w:val="es-ES"/>
+              </w:rPr>
+            </w:pPr>
+          </w:p>
+        </w:tc>
+        <w:tc>
+          <w:tcPr>
+            <w:tcW w:w="1113" w:type="dxa"/>
+          </w:tcPr>
+          <w:p>
+            <w:pPr>
+              <w:rPr>
+                <w:lang w:val="es-ES"/>
+              </w:rPr>
+            </w:pPr>
+          </w:p>
+        </w:tc>
+        <w:tc>
+          <w:tcPr>
+            <w:tcW w:w="1806" w:type="dxa"/>
           </w:tcPr>
           <w:p>
             <w:pPr>
@@ -2083,7 +2199,7 @@
         </w:tc>
         <w:tc>
           <w:tcPr>
-            <w:tcW w:w="1732" w:type="dxa"/>
+            <w:tcW w:w="2085" w:type="dxa"/>
           </w:tcPr>
           <w:p>
             <w:pPr>
@@ -2130,7 +2246,7 @@
       <w:tr>
         <w:tc>
           <w:tcPr>
-            <w:tcW w:w="798" w:type="dxa"/>
+            <w:tcW w:w="1011" w:type="dxa"/>
           </w:tcPr>
           <w:p>
             <w:pPr>
@@ -2148,7 +2264,7 @@
         </w:tc>
         <w:tc>
           <w:tcPr>
-            <w:tcW w:w="1411" w:type="dxa"/>
+            <w:tcW w:w="1833" w:type="dxa"/>
           </w:tcPr>
           <w:p>
             <w:pPr>
@@ -2166,7 +2282,7 @@
         </w:tc>
         <w:tc>
           <w:tcPr>
-            <w:tcW w:w="1550" w:type="dxa"/>
+            <w:tcW w:w="1748" w:type="dxa"/>
           </w:tcPr>
           <w:p>
             <w:pPr>
@@ -2184,31 +2300,31 @@
         </w:tc>
         <w:tc>
           <w:tcPr>
-            <w:tcW w:w="1449" w:type="dxa"/>
-          </w:tcPr>
-          <w:p>
-            <w:pPr>
-              <w:rPr>
-                <w:lang w:val="es-ES"/>
-              </w:rPr>
-            </w:pPr>
-          </w:p>
-        </w:tc>
-        <w:tc>
-          <w:tcPr>
-            <w:tcW w:w="997" w:type="dxa"/>
-          </w:tcPr>
-          <w:p>
-            <w:pPr>
-              <w:rPr>
-                <w:lang w:val="es-ES"/>
-              </w:rPr>
-            </w:pPr>
-          </w:p>
-        </w:tc>
-        <w:tc>
-          <w:tcPr>
-            <w:tcW w:w="1601" w:type="dxa"/>
+            <w:tcW w:w="1631" w:type="dxa"/>
+          </w:tcPr>
+          <w:p>
+            <w:pPr>
+              <w:rPr>
+                <w:lang w:val="es-ES"/>
+              </w:rPr>
+            </w:pPr>
+          </w:p>
+        </w:tc>
+        <w:tc>
+          <w:tcPr>
+            <w:tcW w:w="1113" w:type="dxa"/>
+          </w:tcPr>
+          <w:p>
+            <w:pPr>
+              <w:rPr>
+                <w:lang w:val="es-ES"/>
+              </w:rPr>
+            </w:pPr>
+          </w:p>
+        </w:tc>
+        <w:tc>
+          <w:tcPr>
+            <w:tcW w:w="1806" w:type="dxa"/>
           </w:tcPr>
           <w:p>
             <w:pPr>
@@ -2226,7 +2342,7 @@
         </w:tc>
         <w:tc>
           <w:tcPr>
-            <w:tcW w:w="1732" w:type="dxa"/>
+            <w:tcW w:w="2085" w:type="dxa"/>
           </w:tcPr>
           <w:p>
             <w:pPr>
@@ -2273,7 +2389,7 @@
       <w:tr>
         <w:tc>
           <w:tcPr>
-            <w:tcW w:w="798" w:type="dxa"/>
+            <w:tcW w:w="1011" w:type="dxa"/>
           </w:tcPr>
           <w:p>
             <w:pPr>
@@ -2291,7 +2407,7 @@
         </w:tc>
         <w:tc>
           <w:tcPr>
-            <w:tcW w:w="1411" w:type="dxa"/>
+            <w:tcW w:w="1833" w:type="dxa"/>
           </w:tcPr>
           <w:p>
             <w:pPr>
@@ -2309,7 +2425,7 @@
         </w:tc>
         <w:tc>
           <w:tcPr>
-            <w:tcW w:w="1550" w:type="dxa"/>
+            <w:tcW w:w="1748" w:type="dxa"/>
           </w:tcPr>
           <w:p>
             <w:pPr>
@@ -2327,60 +2443,68 @@
         </w:tc>
         <w:tc>
           <w:tcPr>
-            <w:tcW w:w="1449" w:type="dxa"/>
-          </w:tcPr>
-          <w:p>
-            <w:pPr>
-              <w:rPr>
-                <w:lang w:val="es-ES"/>
-              </w:rPr>
-            </w:pPr>
-          </w:p>
-        </w:tc>
-        <w:tc>
-          <w:tcPr>
-            <w:tcW w:w="997" w:type="dxa"/>
-          </w:tcPr>
-          <w:p>
-            <w:pPr>
-              <w:rPr>
-                <w:lang w:val="es-ES"/>
-              </w:rPr>
-            </w:pPr>
-          </w:p>
-        </w:tc>
-        <w:tc>
-          <w:tcPr>
-            <w:tcW w:w="1601" w:type="dxa"/>
-          </w:tcPr>
-          <w:p>
-            <w:pPr>
-              <w:rPr>
-                <w:lang w:val="es-ES"/>
-              </w:rPr>
-            </w:pPr>
-            <w:r>
-              <w:rPr>
-                <w:lang w:val="es-ES"/>
-              </w:rPr>
-              <w:t>Sergio, 11/12/2025, 26/12/2025, Efectivo, Socios “Destornillador”</w:t>
-            </w:r>
-          </w:p>
-        </w:tc>
-        <w:tc>
-          <w:tcPr>
-            <w:tcW w:w="1732" w:type="dxa"/>
-          </w:tcPr>
-          <w:p>
-            <w:pPr>
-              <w:rPr>
-                <w:lang w:val="es-ES"/>
-              </w:rPr>
-            </w:pPr>
-            <w:r>
-              <w:rPr>
-                <w:lang w:val="es-ES"/>
-              </w:rPr>
+            <w:tcW w:w="1631" w:type="dxa"/>
+          </w:tcPr>
+          <w:p>
+            <w:pPr>
+              <w:rPr>
+                <w:lang w:val="es-ES"/>
+              </w:rPr>
+            </w:pPr>
+          </w:p>
+        </w:tc>
+        <w:tc>
+          <w:tcPr>
+            <w:tcW w:w="1113" w:type="dxa"/>
+          </w:tcPr>
+          <w:p>
+            <w:pPr>
+              <w:rPr>
+                <w:lang w:val="es-ES"/>
+              </w:rPr>
+            </w:pPr>
+          </w:p>
+        </w:tc>
+        <w:tc>
+          <w:tcPr>
+            <w:tcW w:w="1806" w:type="dxa"/>
+          </w:tcPr>
+          <w:p>
+            <w:pPr>
+              <w:rPr>
+                <w:lang w:val="es-ES"/>
+              </w:rPr>
+            </w:pPr>
+            <w:r>
+              <w:rPr>
+                <w:lang w:val="es-ES"/>
+              </w:rPr>
+              <w:t xml:space="preserve">Sergio, 11/12/2025, 26/12/2025, Efectivo, Socios </w:t>
+            </w:r>
+            <w:r>
+              <w:rPr>
+                <w:lang w:val="es-ES"/>
+              </w:rPr>
+              <w:lastRenderedPageBreak/>
+              <w:t>“Destornillador”</w:t>
+            </w:r>
+          </w:p>
+        </w:tc>
+        <w:tc>
+          <w:tcPr>
+            <w:tcW w:w="2085" w:type="dxa"/>
+          </w:tcPr>
+          <w:p>
+            <w:pPr>
+              <w:rPr>
+                <w:lang w:val="es-ES"/>
+              </w:rPr>
+            </w:pPr>
+            <w:r>
+              <w:rPr>
+                <w:lang w:val="es-ES"/>
+              </w:rPr>
+              <w:lastRenderedPageBreak/>
               <w:t>“</w:t>
             </w:r>
             <w:proofErr w:type="spellStart"/>
@@ -2408,7 +2532,14 @@
               <w:rPr>
                 <w:lang w:val="es-ES"/>
               </w:rPr>
-              <w:t>9, 11/12/2025, 26/12/2025, Efectivo, Socios</w:t>
+              <w:t xml:space="preserve">9, 11/12/2025, 26/12/2025, </w:t>
+            </w:r>
+            <w:r>
+              <w:rPr>
+                <w:lang w:val="es-ES"/>
+              </w:rPr>
+              <w:lastRenderedPageBreak/>
+              <w:t>Efectivo, Socios</w:t>
             </w:r>
           </w:p>
         </w:tc>
@@ -2416,25 +2547,26 @@
       <w:tr>
         <w:tc>
           <w:tcPr>
-            <w:tcW w:w="798" w:type="dxa"/>
-          </w:tcPr>
-          <w:p>
-            <w:pPr>
-              <w:rPr>
-                <w:lang w:val="es-ES"/>
-              </w:rPr>
-            </w:pPr>
-            <w:r>
-              <w:rPr>
-                <w:lang w:val="es-ES"/>
-              </w:rPr>
+            <w:tcW w:w="1011" w:type="dxa"/>
+          </w:tcPr>
+          <w:p>
+            <w:pPr>
+              <w:rPr>
+                <w:lang w:val="es-ES"/>
+              </w:rPr>
+            </w:pPr>
+            <w:r>
+              <w:rPr>
+                <w:lang w:val="es-ES"/>
+              </w:rPr>
+              <w:lastRenderedPageBreak/>
               <w:t>CU3_4</w:t>
             </w:r>
           </w:p>
         </w:tc>
         <w:tc>
           <w:tcPr>
-            <w:tcW w:w="1411" w:type="dxa"/>
+            <w:tcW w:w="1833" w:type="dxa"/>
           </w:tcPr>
           <w:p>
             <w:pPr>
@@ -2452,7 +2584,7 @@
         </w:tc>
         <w:tc>
           <w:tcPr>
-            <w:tcW w:w="1550" w:type="dxa"/>
+            <w:tcW w:w="1748" w:type="dxa"/>
           </w:tcPr>
           <w:p>
             <w:pPr>
@@ -2470,7 +2602,7 @@
         </w:tc>
         <w:tc>
           <w:tcPr>
-            <w:tcW w:w="1449" w:type="dxa"/>
+            <w:tcW w:w="1631" w:type="dxa"/>
           </w:tcPr>
           <w:p>
             <w:pPr>
@@ -2488,31 +2620,31 @@
         </w:tc>
         <w:tc>
           <w:tcPr>
-            <w:tcW w:w="997" w:type="dxa"/>
-          </w:tcPr>
-          <w:p>
-            <w:pPr>
-              <w:rPr>
-                <w:lang w:val="es-ES"/>
-              </w:rPr>
-            </w:pPr>
-          </w:p>
-        </w:tc>
-        <w:tc>
-          <w:tcPr>
-            <w:tcW w:w="1601" w:type="dxa"/>
-          </w:tcPr>
-          <w:p>
-            <w:pPr>
-              <w:rPr>
-                <w:lang w:val="es-ES"/>
-              </w:rPr>
-            </w:pPr>
-          </w:p>
-        </w:tc>
-        <w:tc>
-          <w:tcPr>
-            <w:tcW w:w="1732" w:type="dxa"/>
+            <w:tcW w:w="1113" w:type="dxa"/>
+          </w:tcPr>
+          <w:p>
+            <w:pPr>
+              <w:rPr>
+                <w:lang w:val="es-ES"/>
+              </w:rPr>
+            </w:pPr>
+          </w:p>
+        </w:tc>
+        <w:tc>
+          <w:tcPr>
+            <w:tcW w:w="1806" w:type="dxa"/>
+          </w:tcPr>
+          <w:p>
+            <w:pPr>
+              <w:rPr>
+                <w:lang w:val="es-ES"/>
+              </w:rPr>
+            </w:pPr>
+          </w:p>
+        </w:tc>
+        <w:tc>
+          <w:tcPr>
+            <w:tcW w:w="2085" w:type="dxa"/>
           </w:tcPr>
           <w:p>
             <w:pPr>
@@ -2537,7 +2669,32 @@
               <w:rPr>
                 <w:lang w:val="es-ES"/>
               </w:rPr>
+              <w:t>{</w:t>
+            </w:r>
+            <w:r>
+              <w:rPr>
+                <w:lang w:val="es-ES"/>
+              </w:rPr>
               <w:t>Destornillador, hierro, FABRICANTE2, 12</w:t>
+            </w:r>
+            <w:r>
+              <w:rPr>
+                <w:lang w:val="es-ES"/>
+              </w:rPr>
+              <w:t>}</w:t>
+            </w:r>
+          </w:p>
+          <w:p>
+            <w:pPr>
+              <w:rPr>
+                <w:lang w:val="es-ES"/>
+              </w:rPr>
+            </w:pPr>
+            <w:r>
+              <w:rPr>
+                <w:lang w:val="es-ES"/>
+              </w:rPr>
+              <w:t>{Martillo, hierro, FABRICANTE2,15}</w:t>
             </w:r>
           </w:p>
         </w:tc>
@@ -2545,7 +2702,7 @@
       <w:tr>
         <w:tc>
           <w:tcPr>
-            <w:tcW w:w="798" w:type="dxa"/>
+            <w:tcW w:w="1011" w:type="dxa"/>
           </w:tcPr>
           <w:p>
             <w:pPr>
@@ -2563,7 +2720,7 @@
         </w:tc>
         <w:tc>
           <w:tcPr>
-            <w:tcW w:w="1411" w:type="dxa"/>
+            <w:tcW w:w="1833" w:type="dxa"/>
           </w:tcPr>
           <w:p>
             <w:pPr>
@@ -2581,7 +2738,7 @@
         </w:tc>
         <w:tc>
           <w:tcPr>
-            <w:tcW w:w="1550" w:type="dxa"/>
+            <w:tcW w:w="1748" w:type="dxa"/>
           </w:tcPr>
           <w:p>
             <w:pPr>
@@ -2599,19 +2756,19 @@
         </w:tc>
         <w:tc>
           <w:tcPr>
-            <w:tcW w:w="1449" w:type="dxa"/>
-          </w:tcPr>
-          <w:p>
-            <w:pPr>
-              <w:rPr>
-                <w:lang w:val="es-ES"/>
-              </w:rPr>
-            </w:pPr>
-          </w:p>
-        </w:tc>
-        <w:tc>
-          <w:tcPr>
-            <w:tcW w:w="997" w:type="dxa"/>
+            <w:tcW w:w="1631" w:type="dxa"/>
+          </w:tcPr>
+          <w:p>
+            <w:pPr>
+              <w:rPr>
+                <w:lang w:val="es-ES"/>
+              </w:rPr>
+            </w:pPr>
+          </w:p>
+        </w:tc>
+        <w:tc>
+          <w:tcPr>
+            <w:tcW w:w="1113" w:type="dxa"/>
           </w:tcPr>
           <w:p>
             <w:pPr>
@@ -2629,19 +2786,19 @@
         </w:tc>
         <w:tc>
           <w:tcPr>
-            <w:tcW w:w="1601" w:type="dxa"/>
-          </w:tcPr>
-          <w:p>
-            <w:pPr>
-              <w:rPr>
-                <w:lang w:val="es-ES"/>
-              </w:rPr>
-            </w:pPr>
-          </w:p>
-        </w:tc>
-        <w:tc>
-          <w:tcPr>
-            <w:tcW w:w="1732" w:type="dxa"/>
+            <w:tcW w:w="1806" w:type="dxa"/>
+          </w:tcPr>
+          <w:p>
+            <w:pPr>
+              <w:rPr>
+                <w:lang w:val="es-ES"/>
+              </w:rPr>
+            </w:pPr>
+          </w:p>
+        </w:tc>
+        <w:tc>
+          <w:tcPr>
+            <w:tcW w:w="2085" w:type="dxa"/>
           </w:tcPr>
           <w:p>
             <w:pPr>
@@ -2679,7 +2836,6 @@
               <w:rPr>
                 <w:lang w:val="es-ES"/>
               </w:rPr>
-              <w:lastRenderedPageBreak/>
               <w:t>Martillo, hierro y madera, FABRICANTE2, 12</w:t>
             </w:r>
           </w:p>
@@ -2688,26 +2844,25 @@
       <w:tr>
         <w:tc>
           <w:tcPr>
-            <w:tcW w:w="798" w:type="dxa"/>
-          </w:tcPr>
-          <w:p>
-            <w:pPr>
-              <w:rPr>
-                <w:lang w:val="es-ES"/>
-              </w:rPr>
-            </w:pPr>
-            <w:r>
-              <w:rPr>
-                <w:lang w:val="es-ES"/>
-              </w:rPr>
-              <w:lastRenderedPageBreak/>
+            <w:tcW w:w="1011" w:type="dxa"/>
+          </w:tcPr>
+          <w:p>
+            <w:pPr>
+              <w:rPr>
+                <w:lang w:val="es-ES"/>
+              </w:rPr>
+            </w:pPr>
+            <w:r>
+              <w:rPr>
+                <w:lang w:val="es-ES"/>
+              </w:rPr>
               <w:t>CU3_6</w:t>
             </w:r>
           </w:p>
         </w:tc>
         <w:tc>
           <w:tcPr>
-            <w:tcW w:w="1411" w:type="dxa"/>
+            <w:tcW w:w="1833" w:type="dxa"/>
           </w:tcPr>
           <w:p>
             <w:pPr>
@@ -2725,7 +2880,7 @@
         </w:tc>
         <w:tc>
           <w:tcPr>
-            <w:tcW w:w="1550" w:type="dxa"/>
+            <w:tcW w:w="1748" w:type="dxa"/>
           </w:tcPr>
           <w:p>
             <w:pPr>
@@ -2743,31 +2898,31 @@
         </w:tc>
         <w:tc>
           <w:tcPr>
-            <w:tcW w:w="1449" w:type="dxa"/>
-          </w:tcPr>
-          <w:p>
-            <w:pPr>
-              <w:rPr>
-                <w:lang w:val="es-ES"/>
-              </w:rPr>
-            </w:pPr>
-          </w:p>
-        </w:tc>
-        <w:tc>
-          <w:tcPr>
-            <w:tcW w:w="997" w:type="dxa"/>
-          </w:tcPr>
-          <w:p>
-            <w:pPr>
-              <w:rPr>
-                <w:lang w:val="es-ES"/>
-              </w:rPr>
-            </w:pPr>
-          </w:p>
-        </w:tc>
-        <w:tc>
-          <w:tcPr>
-            <w:tcW w:w="1601" w:type="dxa"/>
+            <w:tcW w:w="1631" w:type="dxa"/>
+          </w:tcPr>
+          <w:p>
+            <w:pPr>
+              <w:rPr>
+                <w:lang w:val="es-ES"/>
+              </w:rPr>
+            </w:pPr>
+          </w:p>
+        </w:tc>
+        <w:tc>
+          <w:tcPr>
+            <w:tcW w:w="1113" w:type="dxa"/>
+          </w:tcPr>
+          <w:p>
+            <w:pPr>
+              <w:rPr>
+                <w:lang w:val="es-ES"/>
+              </w:rPr>
+            </w:pPr>
+          </w:p>
+        </w:tc>
+        <w:tc>
+          <w:tcPr>
+            <w:tcW w:w="1806" w:type="dxa"/>
           </w:tcPr>
           <w:p>
             <w:pPr>
@@ -2785,7 +2940,7 @@
         </w:tc>
         <w:tc>
           <w:tcPr>
-            <w:tcW w:w="1732" w:type="dxa"/>
+            <w:tcW w:w="2085" w:type="dxa"/>
           </w:tcPr>
           <w:p>
             <w:pPr>
@@ -2818,7 +2973,7 @@
       <w:tr>
         <w:tc>
           <w:tcPr>
-            <w:tcW w:w="798" w:type="dxa"/>
+            <w:tcW w:w="1011" w:type="dxa"/>
           </w:tcPr>
           <w:p>
             <w:pPr>
@@ -2836,7 +2991,7 @@
         </w:tc>
         <w:tc>
           <w:tcPr>
-            <w:tcW w:w="1411" w:type="dxa"/>
+            <w:tcW w:w="1833" w:type="dxa"/>
           </w:tcPr>
           <w:p>
             <w:pPr>
@@ -2854,7 +3009,7 @@
         </w:tc>
         <w:tc>
           <w:tcPr>
-            <w:tcW w:w="1550" w:type="dxa"/>
+            <w:tcW w:w="1748" w:type="dxa"/>
           </w:tcPr>
           <w:p>
             <w:pPr>
@@ -2872,31 +3027,31 @@
         </w:tc>
         <w:tc>
           <w:tcPr>
-            <w:tcW w:w="1449" w:type="dxa"/>
-          </w:tcPr>
-          <w:p>
-            <w:pPr>
-              <w:rPr>
-                <w:lang w:val="es-ES"/>
-              </w:rPr>
-            </w:pPr>
-          </w:p>
-        </w:tc>
-        <w:tc>
-          <w:tcPr>
-            <w:tcW w:w="997" w:type="dxa"/>
-          </w:tcPr>
-          <w:p>
-            <w:pPr>
-              <w:rPr>
-                <w:lang w:val="es-ES"/>
-              </w:rPr>
-            </w:pPr>
-          </w:p>
-        </w:tc>
-        <w:tc>
-          <w:tcPr>
-            <w:tcW w:w="1601" w:type="dxa"/>
+            <w:tcW w:w="1631" w:type="dxa"/>
+          </w:tcPr>
+          <w:p>
+            <w:pPr>
+              <w:rPr>
+                <w:lang w:val="es-ES"/>
+              </w:rPr>
+            </w:pPr>
+          </w:p>
+        </w:tc>
+        <w:tc>
+          <w:tcPr>
+            <w:tcW w:w="1113" w:type="dxa"/>
+          </w:tcPr>
+          <w:p>
+            <w:pPr>
+              <w:rPr>
+                <w:lang w:val="es-ES"/>
+              </w:rPr>
+            </w:pPr>
+          </w:p>
+        </w:tc>
+        <w:tc>
+          <w:tcPr>
+            <w:tcW w:w="1806" w:type="dxa"/>
           </w:tcPr>
           <w:p>
             <w:pPr>
@@ -2914,7 +3069,7 @@
         </w:tc>
         <w:tc>
           <w:tcPr>
-            <w:tcW w:w="1732" w:type="dxa"/>
+            <w:tcW w:w="2085" w:type="dxa"/>
           </w:tcPr>
           <w:p>
             <w:pPr>
@@ -2947,7 +3102,7 @@
       <w:tr>
         <w:tc>
           <w:tcPr>
-            <w:tcW w:w="798" w:type="dxa"/>
+            <w:tcW w:w="1011" w:type="dxa"/>
           </w:tcPr>
           <w:p>
             <w:pPr>
@@ -2965,7 +3120,7 @@
         </w:tc>
         <w:tc>
           <w:tcPr>
-            <w:tcW w:w="1411" w:type="dxa"/>
+            <w:tcW w:w="1833" w:type="dxa"/>
           </w:tcPr>
           <w:p>
             <w:pPr>
@@ -2983,7 +3138,7 @@
         </w:tc>
         <w:tc>
           <w:tcPr>
-            <w:tcW w:w="1550" w:type="dxa"/>
+            <w:tcW w:w="1748" w:type="dxa"/>
           </w:tcPr>
           <w:p>
             <w:pPr>
@@ -3001,31 +3156,31 @@
         </w:tc>
         <w:tc>
           <w:tcPr>
-            <w:tcW w:w="1449" w:type="dxa"/>
-          </w:tcPr>
-          <w:p>
-            <w:pPr>
-              <w:rPr>
-                <w:lang w:val="es-ES"/>
-              </w:rPr>
-            </w:pPr>
-          </w:p>
-        </w:tc>
-        <w:tc>
-          <w:tcPr>
-            <w:tcW w:w="997" w:type="dxa"/>
-          </w:tcPr>
-          <w:p>
-            <w:pPr>
-              <w:rPr>
-                <w:lang w:val="es-ES"/>
-              </w:rPr>
-            </w:pPr>
-          </w:p>
-        </w:tc>
-        <w:tc>
-          <w:tcPr>
-            <w:tcW w:w="1601" w:type="dxa"/>
+            <w:tcW w:w="1631" w:type="dxa"/>
+          </w:tcPr>
+          <w:p>
+            <w:pPr>
+              <w:rPr>
+                <w:lang w:val="es-ES"/>
+              </w:rPr>
+            </w:pPr>
+          </w:p>
+        </w:tc>
+        <w:tc>
+          <w:tcPr>
+            <w:tcW w:w="1113" w:type="dxa"/>
+          </w:tcPr>
+          <w:p>
+            <w:pPr>
+              <w:rPr>
+                <w:lang w:val="es-ES"/>
+              </w:rPr>
+            </w:pPr>
+          </w:p>
+        </w:tc>
+        <w:tc>
+          <w:tcPr>
+            <w:tcW w:w="1806" w:type="dxa"/>
           </w:tcPr>
           <w:p>
             <w:pPr>
@@ -3043,7 +3198,7 @@
         </w:tc>
         <w:tc>
           <w:tcPr>
-            <w:tcW w:w="1732" w:type="dxa"/>
+            <w:tcW w:w="2085" w:type="dxa"/>
           </w:tcPr>
           <w:p>
             <w:pPr>
@@ -3082,7 +3237,7 @@
       <w:tr>
         <w:tc>
           <w:tcPr>
-            <w:tcW w:w="798" w:type="dxa"/>
+            <w:tcW w:w="1011" w:type="dxa"/>
           </w:tcPr>
           <w:p>
             <w:pPr>
@@ -3100,7 +3255,7 @@
         </w:tc>
         <w:tc>
           <w:tcPr>
-            <w:tcW w:w="1411" w:type="dxa"/>
+            <w:tcW w:w="1833" w:type="dxa"/>
           </w:tcPr>
           <w:p>
             <w:pPr>
@@ -3118,7 +3273,7 @@
         </w:tc>
         <w:tc>
           <w:tcPr>
-            <w:tcW w:w="1550" w:type="dxa"/>
+            <w:tcW w:w="1748" w:type="dxa"/>
           </w:tcPr>
           <w:p>
             <w:pPr>
@@ -3136,31 +3291,31 @@
         </w:tc>
         <w:tc>
           <w:tcPr>
-            <w:tcW w:w="1449" w:type="dxa"/>
-          </w:tcPr>
-          <w:p>
-            <w:pPr>
-              <w:rPr>
-                <w:lang w:val="es-ES"/>
-              </w:rPr>
-            </w:pPr>
-          </w:p>
-        </w:tc>
-        <w:tc>
-          <w:tcPr>
-            <w:tcW w:w="997" w:type="dxa"/>
-          </w:tcPr>
-          <w:p>
-            <w:pPr>
-              <w:rPr>
-                <w:lang w:val="es-ES"/>
-              </w:rPr>
-            </w:pPr>
-          </w:p>
-        </w:tc>
-        <w:tc>
-          <w:tcPr>
-            <w:tcW w:w="1601" w:type="dxa"/>
+            <w:tcW w:w="1631" w:type="dxa"/>
+          </w:tcPr>
+          <w:p>
+            <w:pPr>
+              <w:rPr>
+                <w:lang w:val="es-ES"/>
+              </w:rPr>
+            </w:pPr>
+          </w:p>
+        </w:tc>
+        <w:tc>
+          <w:tcPr>
+            <w:tcW w:w="1113" w:type="dxa"/>
+          </w:tcPr>
+          <w:p>
+            <w:pPr>
+              <w:rPr>
+                <w:lang w:val="es-ES"/>
+              </w:rPr>
+            </w:pPr>
+          </w:p>
+        </w:tc>
+        <w:tc>
+          <w:tcPr>
+            <w:tcW w:w="1806" w:type="dxa"/>
           </w:tcPr>
           <w:p>
             <w:pPr>
@@ -3217,7 +3372,7 @@
         </w:tc>
         <w:tc>
           <w:tcPr>
-            <w:tcW w:w="1732" w:type="dxa"/>
+            <w:tcW w:w="2085" w:type="dxa"/>
           </w:tcPr>
           <w:p>
             <w:pPr>
@@ -3237,25 +3392,26 @@
       <w:tr>
         <w:tc>
           <w:tcPr>
-            <w:tcW w:w="798" w:type="dxa"/>
-          </w:tcPr>
-          <w:p>
-            <w:pPr>
-              <w:rPr>
-                <w:lang w:val="es-ES"/>
-              </w:rPr>
-            </w:pPr>
-            <w:r>
-              <w:rPr>
-                <w:lang w:val="es-ES"/>
-              </w:rPr>
+            <w:tcW w:w="1011" w:type="dxa"/>
+          </w:tcPr>
+          <w:p>
+            <w:pPr>
+              <w:rPr>
+                <w:lang w:val="es-ES"/>
+              </w:rPr>
+            </w:pPr>
+            <w:r>
+              <w:rPr>
+                <w:lang w:val="es-ES"/>
+              </w:rPr>
+              <w:lastRenderedPageBreak/>
               <w:t>CU3_10</w:t>
             </w:r>
           </w:p>
         </w:tc>
         <w:tc>
           <w:tcPr>
-            <w:tcW w:w="1411" w:type="dxa"/>
+            <w:tcW w:w="1833" w:type="dxa"/>
           </w:tcPr>
           <w:p>
             <w:pPr>
@@ -3279,7 +3435,7 @@
         </w:tc>
         <w:tc>
           <w:tcPr>
-            <w:tcW w:w="1550" w:type="dxa"/>
+            <w:tcW w:w="1748" w:type="dxa"/>
           </w:tcPr>
           <w:p>
             <w:pPr>
@@ -3297,31 +3453,31 @@
         </w:tc>
         <w:tc>
           <w:tcPr>
-            <w:tcW w:w="1449" w:type="dxa"/>
-          </w:tcPr>
-          <w:p>
-            <w:pPr>
-              <w:rPr>
-                <w:lang w:val="es-ES"/>
-              </w:rPr>
-            </w:pPr>
-          </w:p>
-        </w:tc>
-        <w:tc>
-          <w:tcPr>
-            <w:tcW w:w="997" w:type="dxa"/>
-          </w:tcPr>
-          <w:p>
-            <w:pPr>
-              <w:rPr>
-                <w:lang w:val="es-ES"/>
-              </w:rPr>
-            </w:pPr>
-          </w:p>
-        </w:tc>
-        <w:tc>
-          <w:tcPr>
-            <w:tcW w:w="1601" w:type="dxa"/>
+            <w:tcW w:w="1631" w:type="dxa"/>
+          </w:tcPr>
+          <w:p>
+            <w:pPr>
+              <w:rPr>
+                <w:lang w:val="es-ES"/>
+              </w:rPr>
+            </w:pPr>
+          </w:p>
+        </w:tc>
+        <w:tc>
+          <w:tcPr>
+            <w:tcW w:w="1113" w:type="dxa"/>
+          </w:tcPr>
+          <w:p>
+            <w:pPr>
+              <w:rPr>
+                <w:lang w:val="es-ES"/>
+              </w:rPr>
+            </w:pPr>
+          </w:p>
+        </w:tc>
+        <w:tc>
+          <w:tcPr>
+            <w:tcW w:w="1806" w:type="dxa"/>
           </w:tcPr>
           <w:p>
             <w:pPr>
@@ -3339,7 +3495,7 @@
         </w:tc>
         <w:tc>
           <w:tcPr>
-            <w:tcW w:w="1732" w:type="dxa"/>
+            <w:tcW w:w="2085" w:type="dxa"/>
           </w:tcPr>
           <w:p>
             <w:pPr>
@@ -3365,6 +3521,317 @@
                 <w:lang w:val="es-ES"/>
               </w:rPr>
               <w:t xml:space="preserve">“Destornillador”, se modifica automáticamente a un porcentaje válido 100% de rebaja </w:t>
+            </w:r>
+          </w:p>
+        </w:tc>
+      </w:tr>
+      <w:tr>
+        <w:tc>
+          <w:tcPr>
+            <w:tcW w:w="1011" w:type="dxa"/>
+          </w:tcPr>
+          <w:p>
+            <w:pPr>
+              <w:rPr>
+                <w:lang w:val="es-ES"/>
+              </w:rPr>
+            </w:pPr>
+            <w:r>
+              <w:rPr>
+                <w:lang w:val="es-ES"/>
+              </w:rPr>
+              <w:t>CU3_11</w:t>
+            </w:r>
+          </w:p>
+        </w:tc>
+        <w:tc>
+          <w:tcPr>
+            <w:tcW w:w="1833" w:type="dxa"/>
+          </w:tcPr>
+          <w:p>
+            <w:pPr>
+              <w:rPr>
+                <w:lang w:val="es-ES"/>
+              </w:rPr>
+            </w:pPr>
+            <w:r>
+              <w:rPr>
+                <w:lang w:val="es-ES"/>
+              </w:rPr>
+              <w:t>Esc6/</w:t>
+            </w:r>
+            <w:r>
+              <w:rPr>
+                <w:lang w:val="es-ES"/>
+              </w:rPr>
+              <w:t>No hay herramientas seleccionadas</w:t>
+            </w:r>
+          </w:p>
+        </w:tc>
+        <w:tc>
+          <w:tcPr>
+            <w:tcW w:w="1748" w:type="dxa"/>
+          </w:tcPr>
+          <w:p>
+            <w:pPr>
+              <w:rPr>
+                <w:lang w:val="es-ES"/>
+              </w:rPr>
+            </w:pPr>
+            <w:r>
+              <w:rPr>
+                <w:lang w:val="es-ES"/>
+              </w:rPr>
+              <w:t>Lista de herramientas disponibles</w:t>
+            </w:r>
+          </w:p>
+        </w:tc>
+        <w:tc>
+          <w:tcPr>
+            <w:tcW w:w="1631" w:type="dxa"/>
+          </w:tcPr>
+          <w:p>
+            <w:pPr>
+              <w:rPr>
+                <w:lang w:val="es-ES"/>
+              </w:rPr>
+            </w:pPr>
+          </w:p>
+        </w:tc>
+        <w:tc>
+          <w:tcPr>
+            <w:tcW w:w="1113" w:type="dxa"/>
+          </w:tcPr>
+          <w:p>
+            <w:pPr>
+              <w:rPr>
+                <w:lang w:val="es-ES"/>
+              </w:rPr>
+            </w:pPr>
+          </w:p>
+        </w:tc>
+        <w:tc>
+          <w:tcPr>
+            <w:tcW w:w="1806" w:type="dxa"/>
+          </w:tcPr>
+          <w:p>
+            <w:pPr>
+              <w:rPr>
+                <w:lang w:val="es-ES"/>
+              </w:rPr>
+            </w:pPr>
+            <w:r>
+              <w:rPr>
+                <w:lang w:val="es-ES"/>
+              </w:rPr>
+              <w:t>Seleccionado: nada</w:t>
+            </w:r>
+          </w:p>
+        </w:tc>
+        <w:tc>
+          <w:tcPr>
+            <w:tcW w:w="2085" w:type="dxa"/>
+          </w:tcPr>
+          <w:p>
+            <w:pPr>
+              <w:rPr>
+                <w:lang w:val="es-ES"/>
+              </w:rPr>
+            </w:pPr>
+            <w:r>
+              <w:rPr>
+                <w:lang w:val="es-ES"/>
+              </w:rPr>
+              <w:t>Mostrado: No aparece el botón de hacer oferta</w:t>
+            </w:r>
+          </w:p>
+        </w:tc>
+      </w:tr>
+      <w:tr>
+        <w:tc>
+          <w:tcPr>
+            <w:tcW w:w="1011" w:type="dxa"/>
+          </w:tcPr>
+          <w:p>
+            <w:pPr>
+              <w:rPr>
+                <w:lang w:val="es-ES"/>
+              </w:rPr>
+            </w:pPr>
+            <w:r>
+              <w:rPr>
+                <w:lang w:val="es-ES"/>
+              </w:rPr>
+              <w:t>CU3_1</w:t>
+            </w:r>
+            <w:r>
+              <w:rPr>
+                <w:lang w:val="es-ES"/>
+              </w:rPr>
+              <w:t>2</w:t>
+            </w:r>
+          </w:p>
+        </w:tc>
+        <w:tc>
+          <w:tcPr>
+            <w:tcW w:w="1833" w:type="dxa"/>
+          </w:tcPr>
+          <w:p>
+            <w:pPr>
+              <w:rPr>
+                <w:lang w:val="es-ES"/>
+              </w:rPr>
+            </w:pPr>
+            <w:r>
+              <w:rPr>
+                <w:lang w:val="es-ES"/>
+              </w:rPr>
+              <w:t>Esc</w:t>
+            </w:r>
+            <w:r>
+              <w:rPr>
+                <w:lang w:val="es-ES"/>
+              </w:rPr>
+              <w:t>7</w:t>
+            </w:r>
+            <w:r>
+              <w:rPr>
+                <w:lang w:val="es-ES"/>
+              </w:rPr>
+              <w:t xml:space="preserve">/Método de pago </w:t>
+            </w:r>
+            <w:r>
+              <w:rPr>
+                <w:lang w:val="es-ES"/>
+              </w:rPr>
+              <w:t>erróneo</w:t>
+            </w:r>
+          </w:p>
+        </w:tc>
+        <w:tc>
+          <w:tcPr>
+            <w:tcW w:w="1748" w:type="dxa"/>
+          </w:tcPr>
+          <w:p>
+            <w:pPr>
+              <w:rPr>
+                <w:lang w:val="es-ES"/>
+              </w:rPr>
+            </w:pPr>
+            <w:r>
+              <w:rPr>
+                <w:lang w:val="es-ES"/>
+              </w:rPr>
+              <w:t>Lista de herramientas disponibles</w:t>
+            </w:r>
+          </w:p>
+        </w:tc>
+        <w:tc>
+          <w:tcPr>
+            <w:tcW w:w="1631" w:type="dxa"/>
+          </w:tcPr>
+          <w:p>
+            <w:pPr>
+              <w:rPr>
+                <w:lang w:val="es-ES"/>
+              </w:rPr>
+            </w:pPr>
+          </w:p>
+        </w:tc>
+        <w:tc>
+          <w:tcPr>
+            <w:tcW w:w="1113" w:type="dxa"/>
+          </w:tcPr>
+          <w:p>
+            <w:pPr>
+              <w:rPr>
+                <w:lang w:val="es-ES"/>
+              </w:rPr>
+            </w:pPr>
+          </w:p>
+        </w:tc>
+        <w:tc>
+          <w:tcPr>
+            <w:tcW w:w="1806" w:type="dxa"/>
+          </w:tcPr>
+          <w:p>
+            <w:pPr>
+              <w:rPr>
+                <w:lang w:val="es-ES"/>
+              </w:rPr>
+            </w:pPr>
+            <w:r>
+              <w:rPr>
+                <w:lang w:val="es-ES"/>
+              </w:rPr>
+              <w:t xml:space="preserve">Sergio, 11/12/2025, </w:t>
+            </w:r>
+            <w:r>
+              <w:rPr>
+                <w:lang w:val="es-ES"/>
+              </w:rPr>
+              <w:t>29</w:t>
+            </w:r>
+            <w:r>
+              <w:rPr>
+                <w:lang w:val="es-ES"/>
+              </w:rPr>
+              <w:t xml:space="preserve">/12/2025, </w:t>
+            </w:r>
+            <w:r>
+              <w:rPr>
+                <w:lang w:val="es-ES"/>
+              </w:rPr>
+              <w:t>NULL</w:t>
+            </w:r>
+            <w:r>
+              <w:rPr>
+                <w:lang w:val="es-ES"/>
+              </w:rPr>
+              <w:t>, Socios “Destornillador”</w:t>
+            </w:r>
+          </w:p>
+        </w:tc>
+        <w:tc>
+          <w:tcPr>
+            <w:tcW w:w="2085" w:type="dxa"/>
+          </w:tcPr>
+          <w:p>
+            <w:pPr>
+              <w:rPr>
+                <w:lang w:val="es-ES"/>
+              </w:rPr>
+            </w:pPr>
+            <w:r>
+              <w:rPr>
+                <w:lang w:val="es-ES"/>
+              </w:rPr>
+              <w:t>ERROR</w:t>
+            </w:r>
+          </w:p>
+          <w:p>
+            <w:pPr>
+              <w:rPr>
+                <w:lang w:val="es-ES"/>
+              </w:rPr>
+            </w:pPr>
+            <w:r>
+              <w:rPr>
+                <w:lang w:val="es-ES"/>
+              </w:rPr>
+              <w:t xml:space="preserve">"Falta un </w:t>
+            </w:r>
+            <w:r>
+              <w:rPr>
+                <w:lang w:val="es-ES"/>
+              </w:rPr>
+              <w:t>método</w:t>
+            </w:r>
+            <w:r>
+              <w:rPr>
+                <w:lang w:val="es-ES"/>
+              </w:rPr>
+              <w:t xml:space="preserve"> de pago válido"</w:t>
             </w:r>
           </w:p>
         </w:tc>
@@ -3476,7 +3943,6 @@
         <w:rPr>
           <w:lang w:val="es-ES"/>
         </w:rPr>
-        <w:lastRenderedPageBreak/>
         <w:t>Software</w:t>
       </w:r>
       <w:bookmarkEnd w:id="6"/>
@@ -3637,11 +4103,15 @@
       <w:pPr>
         <w:ind w:left="708"/>
         <w:rPr>
+          <w:sz w:val="30"/>
+          <w:szCs w:val="30"/>
           <w:lang w:val="es-ES"/>
         </w:rPr>
       </w:pPr>
       <w:r>
         <w:rPr>
+          <w:sz w:val="30"/>
+          <w:szCs w:val="30"/>
           <w:lang w:val="es-ES"/>
         </w:rPr>
         <w:t xml:space="preserve">Antes de correr todas las pruebas funcionales aplicar los archivos dentro de la API y la carpeta BBDD, </w:t>
@@ -3649,6 +4119,8 @@
       <w:proofErr w:type="spellStart"/>
       <w:r>
         <w:rPr>
+          <w:sz w:val="30"/>
+          <w:szCs w:val="30"/>
           <w:lang w:val="es-ES"/>
         </w:rPr>
         <w:t>dbo.AspNetUsers.data.sql</w:t>
@@ -3656,6 +4128,8 @@
       <w:proofErr w:type="spellEnd"/>
       <w:r>
         <w:rPr>
+          <w:sz w:val="30"/>
+          <w:szCs w:val="30"/>
           <w:lang w:val="es-ES"/>
         </w:rPr>
         <w:t xml:space="preserve"> y </w:t>
@@ -3663,6 +4137,8 @@
       <w:proofErr w:type="spellStart"/>
       <w:r>
         <w:rPr>
+          <w:sz w:val="30"/>
+          <w:szCs w:val="30"/>
           <w:lang w:val="es-ES"/>
         </w:rPr>
         <w:t>dbo.herramientasyFabricantesOFERTA.data.sql</w:t>
@@ -3670,6 +4146,8 @@
       <w:proofErr w:type="spellEnd"/>
       <w:r>
         <w:rPr>
+          <w:sz w:val="30"/>
+          <w:szCs w:val="30"/>
           <w:lang w:val="es-ES"/>
         </w:rPr>
         <w:t>.</w:t>
@@ -4925,7 +5403,6 @@
   <w:style w:type="character" w:default="1" w:styleId="Fuentedeprrafopredeter">
     <w:name w:val="Default Paragraph Font"/>
     <w:uiPriority w:val="1"/>
-    <w:semiHidden/>
     <w:unhideWhenUsed/>
   </w:style>
   <w:style w:type="table" w:default="1" w:styleId="Tablanormal">
@@ -5607,6 +6084,15 @@
 </file>
 
 <file path=customXml/item1.xml><?xml version="1.0" encoding="utf-8"?>
+<?mso-contentType ?>
+<FormTemplates xmlns="http://schemas.microsoft.com/sharepoint/v3/contenttype/forms">
+  <Display>DocumentLibraryForm</Display>
+  <Edit>DocumentLibraryForm</Edit>
+  <New>DocumentLibraryForm</New>
+</FormTemplates>
+</file>
+
+<file path=customXml/item2.xml><?xml version="1.0" encoding="utf-8"?>
 <p:properties xmlns:p="http://schemas.microsoft.com/office/2006/metadata/properties" xmlns:xsi="http://www.w3.org/2001/XMLSchema-instance" xmlns:pc="http://schemas.microsoft.com/office/infopath/2007/PartnerControls">
   <documentManagement>
     <TaxCatchAll xmlns="e70db583-0384-45f2-bee4-d71087a4ae97" xsi:nil="true"/>
@@ -5615,15 +6101,6 @@
     </lcf76f155ced4ddcb4097134ff3c332f>
   </documentManagement>
 </p:properties>
-</file>
-
-<file path=customXml/item2.xml><?xml version="1.0" encoding="utf-8"?>
-<?mso-contentType ?>
-<FormTemplates xmlns="http://schemas.microsoft.com/sharepoint/v3/contenttype/forms">
-  <Display>DocumentLibraryForm</Display>
-  <Edit>DocumentLibraryForm</Edit>
-  <New>DocumentLibraryForm</New>
-</FormTemplates>
 </file>
 
 <file path=customXml/item3.xml><?xml version="1.0" encoding="utf-8"?>
@@ -5870,20 +6347,20 @@
 </file>
 
 <file path=customXml/itemProps1.xml><?xml version="1.0" encoding="utf-8"?>
+<ds:datastoreItem xmlns:ds="http://schemas.openxmlformats.org/officeDocument/2006/customXml" ds:itemID="{396B05A9-87A0-4E80-9F96-F1F0943B6178}">
+  <ds:schemaRefs>
+    <ds:schemaRef ds:uri="http://schemas.microsoft.com/sharepoint/v3/contenttype/forms"/>
+  </ds:schemaRefs>
+</ds:datastoreItem>
+</file>
+
+<file path=customXml/itemProps2.xml><?xml version="1.0" encoding="utf-8"?>
 <ds:datastoreItem xmlns:ds="http://schemas.openxmlformats.org/officeDocument/2006/customXml" ds:itemID="{1E552648-2456-4AEB-9337-C6642FAB7968}">
   <ds:schemaRefs>
     <ds:schemaRef ds:uri="http://schemas.microsoft.com/office/2006/metadata/properties"/>
     <ds:schemaRef ds:uri="http://schemas.microsoft.com/office/infopath/2007/PartnerControls"/>
     <ds:schemaRef ds:uri="e70db583-0384-45f2-bee4-d71087a4ae97"/>
     <ds:schemaRef ds:uri="d6169a53-58c7-4834-a922-92accc0d3c74"/>
-  </ds:schemaRefs>
-</ds:datastoreItem>
-</file>
-
-<file path=customXml/itemProps2.xml><?xml version="1.0" encoding="utf-8"?>
-<ds:datastoreItem xmlns:ds="http://schemas.openxmlformats.org/officeDocument/2006/customXml" ds:itemID="{396B05A9-87A0-4E80-9F96-F1F0943B6178}">
-  <ds:schemaRefs>
-    <ds:schemaRef ds:uri="http://schemas.microsoft.com/sharepoint/v3/contenttype/forms"/>
   </ds:schemaRefs>
 </ds:datastoreItem>
 </file>

</xml_diff>